<commit_message>
diagrams and net market income
</commit_message>
<xml_diff>
--- a/methodology/Methodology.docx
+++ b/methodology/Methodology.docx
@@ -3241,7 +3241,7 @@
         <w:rPr>
           <w:lang w:val="en-US"/>
         </w:rPr>
-        <w:t xml:space="preserve">Following the CEQ framework, indirect taxes are incorporated at the post-fiscal income stage. In Mexico, the main indirect tax is the Value Added Tax (IVA) with a general rate of 16%. Certain goods and services are exempt or subject to a 0% rate (e.g., food, medicines, books). The estimation proceeds in four steps: </w:t>
+        <w:t xml:space="preserve">Following the CEQ framework, indirect taxes are incorporated at the post-fiscal income stage. In Mexico, the indirect tax is the Value Added Tax (IVA) with a rate of 16%. Certain goods and services are exempt or subject to a 0% rate (e.g., food, medicines). The estimation proceeds in four steps: </w:t>
       </w:r>
       <w:proofErr w:type="spellStart"/>
       <w:r>
@@ -3326,47 +3326,55 @@
           <w:numId w:val="5"/>
         </w:numPr>
         <w:rPr>
-          <w:lang w:val="en-US"/>
-        </w:rPr>
-      </w:pPr>
-      <w:r>
-        <w:rPr>
+          <w:highlight w:val="yellow"/>
+          <w:lang w:val="en-US"/>
+        </w:rPr>
+      </w:pPr>
+      <w:r>
+        <w:rPr>
+          <w:highlight w:val="yellow"/>
           <w:lang w:val="en-US"/>
         </w:rPr>
         <w:t xml:space="preserve">2018: Based on the four-digit </w:t>
       </w:r>
       <w:r>
         <w:rPr>
+          <w:highlight w:val="yellow"/>
           <w:lang w:val="en-US"/>
         </w:rPr>
         <w:t>Classification of Individual Consumption According to Purpose</w:t>
       </w:r>
       <w:r>
         <w:rPr>
+          <w:highlight w:val="yellow"/>
           <w:lang w:val="en-US"/>
         </w:rPr>
         <w:t xml:space="preserve"> (</w:t>
       </w:r>
       <w:r>
         <w:rPr>
+          <w:highlight w:val="yellow"/>
           <w:lang w:val="en-US"/>
         </w:rPr>
         <w:t>COICOP</w:t>
       </w:r>
       <w:r>
         <w:rPr>
+          <w:highlight w:val="yellow"/>
           <w:lang w:val="en-US"/>
         </w:rPr>
         <w:t>)</w:t>
       </w:r>
       <w:r>
         <w:rPr>
+          <w:highlight w:val="yellow"/>
           <w:lang w:val="en-US"/>
         </w:rPr>
         <w:t xml:space="preserve"> </w:t>
       </w:r>
       <w:r>
         <w:rPr>
+          <w:highlight w:val="yellow"/>
           <w:lang w:val="en-US"/>
         </w:rPr>
         <w:t xml:space="preserve">classification used by INEGI at that time. Taxable categories include cleaning products (C), personal care (D), communications and fuels (F and G), clothing (H), furniture (I), household appliances (K), recreation (L), transport (M), and other non-basic goods (N). </w:t>
@@ -3500,7 +3508,7 @@
         <w:rPr>
           <w:lang w:val="en-US"/>
         </w:rPr>
-        <w:t xml:space="preserve">), which includes codes for informal markets, street vendors, and other non-registered establishments. Purchases made at location with codes 1,2,3, or 17 are classified as informal. These codes consistently identify: </w:t>
+        <w:t xml:space="preserve">), which includes codes for informal markets, street vendors, and other non-registered establishments. Purchases made at location with codes 1,2,3, or 17 are classified as informal. </w:t>
       </w:r>
     </w:p>
     <w:p>
@@ -3518,21 +3526,13 @@
         <w:rPr>
           <w:lang w:val="en-US"/>
         </w:rPr>
-        <w:t>1- Street market (</w:t>
-      </w:r>
-      <w:proofErr w:type="spellStart"/>
-      <w:r>
-        <w:rPr>
-          <w:lang w:val="en-US"/>
-        </w:rPr>
-        <w:t>tianguis</w:t>
-      </w:r>
-      <w:proofErr w:type="spellEnd"/>
-      <w:r>
-        <w:rPr>
-          <w:lang w:val="en-US"/>
-        </w:rPr>
-        <w:t>)</w:t>
+        <w:t xml:space="preserve">1- </w:t>
+      </w:r>
+      <w:r>
+        <w:rPr>
+          <w:lang w:val="en-US"/>
+        </w:rPr>
+        <w:t>Mercado</w:t>
       </w:r>
     </w:p>
     <w:p>
@@ -3550,7 +3550,39 @@
         <w:rPr>
           <w:lang w:val="en-US"/>
         </w:rPr>
-        <w:t xml:space="preserve">2- Public market </w:t>
+        <w:t xml:space="preserve">2- </w:t>
+      </w:r>
+      <w:r>
+        <w:rPr>
+          <w:lang w:val="en-US"/>
+        </w:rPr>
+        <w:t>Street</w:t>
+      </w:r>
+      <w:r>
+        <w:rPr>
+          <w:lang w:val="en-US"/>
+        </w:rPr>
+        <w:t xml:space="preserve"> market </w:t>
+      </w:r>
+      <w:r>
+        <w:rPr>
+          <w:lang w:val="en-US"/>
+        </w:rPr>
+        <w:t>(</w:t>
+      </w:r>
+      <w:proofErr w:type="spellStart"/>
+      <w:r>
+        <w:rPr>
+          <w:lang w:val="en-US"/>
+        </w:rPr>
+        <w:t>tianguis</w:t>
+      </w:r>
+      <w:proofErr w:type="spellEnd"/>
+      <w:r>
+        <w:rPr>
+          <w:lang w:val="en-US"/>
+        </w:rPr>
+        <w:t>)</w:t>
       </w:r>
     </w:p>
     <w:p>
@@ -3586,7 +3618,19 @@
         <w:rPr>
           <w:lang w:val="en-US"/>
         </w:rPr>
-        <w:t xml:space="preserve">17- Other informal location </w:t>
+        <w:t xml:space="preserve">17- </w:t>
+      </w:r>
+      <w:r>
+        <w:rPr>
+          <w:lang w:val="en-US"/>
+        </w:rPr>
+        <w:t xml:space="preserve">Person </w:t>
+      </w:r>
+      <w:r>
+        <w:rPr>
+          <w:lang w:val="en-US"/>
+        </w:rPr>
+        <w:t xml:space="preserve"> </w:t>
       </w:r>
     </w:p>
     <w:p>
@@ -4154,6 +4198,7 @@
         <w:rPr>
           <w:b/>
           <w:bCs/>
+          <w:highlight w:val="yellow"/>
           <w:lang w:val="en-US"/>
         </w:rPr>
       </w:pPr>
@@ -4161,6 +4206,7 @@
         <w:rPr>
           <w:b/>
           <w:bCs/>
+          <w:highlight w:val="yellow"/>
           <w:lang w:val="en-US"/>
         </w:rPr>
         <w:t xml:space="preserve">Attributing IVA to Disposable Income </w:t>
@@ -4169,11 +4215,13 @@
     <w:p>
       <w:pPr>
         <w:rPr>
-          <w:lang w:val="en-US"/>
-        </w:rPr>
-      </w:pPr>
-      <w:r>
-        <w:rPr>
+          <w:highlight w:val="yellow"/>
+          <w:lang w:val="en-US"/>
+        </w:rPr>
+      </w:pPr>
+      <w:r>
+        <w:rPr>
+          <w:highlight w:val="yellow"/>
           <w:lang w:val="en-US"/>
         </w:rPr>
         <w:t xml:space="preserve">The CEQ incidence analysis requires that the tax burden be expressed as a proportion of household disposable income. However, IVA is paid out of total consumption, not directly out of income. To allocate the household’s total IVA to its disposable income in a consistent manner, we follow a proportional attribution method. </w:t>
@@ -4182,11 +4230,13 @@
     <w:p>
       <w:pPr>
         <w:rPr>
-          <w:lang w:val="en-US"/>
-        </w:rPr>
-      </w:pPr>
-      <w:r>
-        <w:rPr>
+          <w:highlight w:val="yellow"/>
+          <w:lang w:val="en-US"/>
+        </w:rPr>
+      </w:pPr>
+      <w:r>
+        <w:rPr>
+          <w:highlight w:val="yellow"/>
           <w:lang w:val="en-US"/>
         </w:rPr>
         <w:t xml:space="preserve">First, we define a “taxable expenditure base” for the household, denoted </w:t>
@@ -4194,6 +4244,7 @@
       <w:proofErr w:type="spellStart"/>
       <w:r>
         <w:rPr>
+          <w:highlight w:val="yellow"/>
           <w:lang w:val="en-US"/>
         </w:rPr>
         <w:t>Gasto_HH_tri</w:t>
@@ -4201,6 +4252,7 @@
       <w:proofErr w:type="spellEnd"/>
       <w:r>
         <w:rPr>
+          <w:highlight w:val="yellow"/>
           <w:lang w:val="en-US"/>
         </w:rPr>
         <w:t xml:space="preserve">. This base excludes expenditure on goods that are </w:t>
@@ -4208,6 +4260,7 @@
       <w:proofErr w:type="spellStart"/>
       <w:r>
         <w:rPr>
+          <w:highlight w:val="yellow"/>
           <w:lang w:val="en-US"/>
         </w:rPr>
         <w:t>zere</w:t>
@@ -4215,6 +4268,7 @@
       <w:proofErr w:type="spellEnd"/>
       <w:r>
         <w:rPr>
+          <w:highlight w:val="yellow"/>
           <w:lang w:val="en-US"/>
         </w:rPr>
         <w:t xml:space="preserve">-rated or exempt (food, cleaning, personal care), because those items do not generate IVA even if purchased formally. Usually the ENIGH </w:t>
@@ -4222,6 +4276,7 @@
       <w:proofErr w:type="spellStart"/>
       <w:r>
         <w:rPr>
+          <w:highlight w:val="yellow"/>
           <w:lang w:val="en-US"/>
         </w:rPr>
         <w:t>concentradohogar</w:t>
@@ -4229,6 +4284,7 @@
       <w:proofErr w:type="spellEnd"/>
       <w:r>
         <w:rPr>
+          <w:highlight w:val="yellow"/>
           <w:lang w:val="en-US"/>
         </w:rPr>
         <w:t xml:space="preserve"> file: </w:t>
@@ -4237,6 +4293,7 @@
     <w:p>
       <w:pPr>
         <w:rPr>
+          <w:highlight w:val="yellow"/>
           <w:lang w:val="en-US"/>
         </w:rPr>
       </w:pPr>
@@ -4245,6 +4302,7 @@
           <m:r>
             <w:rPr>
               <w:rFonts w:ascii="Cambria Math" w:hAnsi="Cambria Math"/>
+              <w:highlight w:val="yellow"/>
               <w:lang w:val="en-US"/>
             </w:rPr>
             <w:lastRenderedPageBreak/>
@@ -4257,6 +4315,7 @@
                   <w:rPr>
                     <w:rFonts w:ascii="Cambria Math" w:hAnsi="Cambria Math"/>
                     <w:i/>
+                    <w:highlight w:val="yellow"/>
                     <w:lang w:val="en-US"/>
                   </w:rPr>
                 </w:ins>
@@ -4266,6 +4325,7 @@
               <m:r>
                 <w:rPr>
                   <w:rFonts w:ascii="Cambria Math" w:hAnsi="Cambria Math"/>
+                  <w:highlight w:val="yellow"/>
                   <w:lang w:val="en-US"/>
                 </w:rPr>
                 <m:t>alimentos+limpieza+cuidados</m:t>
@@ -4278,11 +4338,13 @@
     <w:p>
       <w:pPr>
         <w:rPr>
-          <w:lang w:val="en-US"/>
-        </w:rPr>
-      </w:pPr>
-      <w:r>
-        <w:rPr>
+          <w:highlight w:val="yellow"/>
+          <w:lang w:val="en-US"/>
+        </w:rPr>
+      </w:pPr>
+      <w:r>
+        <w:rPr>
+          <w:highlight w:val="yellow"/>
           <w:lang w:val="en-US"/>
         </w:rPr>
         <w:t xml:space="preserve">Where: </w:t>
@@ -4296,11 +4358,13 @@
           <w:numId w:val="5"/>
         </w:numPr>
         <w:rPr>
-          <w:lang w:val="en-US"/>
-        </w:rPr>
-      </w:pPr>
-      <w:r>
-        <w:rPr>
+          <w:highlight w:val="yellow"/>
+          <w:lang w:val="en-US"/>
+        </w:rPr>
+      </w:pPr>
+      <w:r>
+        <w:rPr>
+          <w:highlight w:val="yellow"/>
           <w:lang w:val="en-US"/>
         </w:rPr>
         <w:t xml:space="preserve">Gasto </w:t>
@@ -4308,6 +4372,7 @@
       <w:proofErr w:type="spellStart"/>
       <w:r>
         <w:rPr>
+          <w:highlight w:val="yellow"/>
           <w:lang w:val="en-US"/>
         </w:rPr>
         <w:t>mon</w:t>
@@ -4315,6 +4380,7 @@
       <w:proofErr w:type="spellEnd"/>
       <w:r>
         <w:rPr>
+          <w:highlight w:val="yellow"/>
           <w:lang w:val="en-US"/>
         </w:rPr>
         <w:t xml:space="preserve"> = total </w:t>
@@ -4322,6 +4388,7 @@
       <w:proofErr w:type="spellStart"/>
       <w:r>
         <w:rPr>
+          <w:highlight w:val="yellow"/>
           <w:lang w:val="en-US"/>
         </w:rPr>
         <w:t>quartly</w:t>
@@ -4329,6 +4396,7 @@
       <w:proofErr w:type="spellEnd"/>
       <w:r>
         <w:rPr>
+          <w:highlight w:val="yellow"/>
           <w:lang w:val="en-US"/>
         </w:rPr>
         <w:t xml:space="preserve"> monetary expenditure, </w:t>
@@ -4342,11 +4410,13 @@
           <w:numId w:val="5"/>
         </w:numPr>
         <w:rPr>
-          <w:lang w:val="en-US"/>
-        </w:rPr>
-      </w:pPr>
-      <w:r>
-        <w:rPr>
+          <w:highlight w:val="yellow"/>
+          <w:lang w:val="en-US"/>
+        </w:rPr>
+      </w:pPr>
+      <w:r>
+        <w:rPr>
+          <w:highlight w:val="yellow"/>
           <w:lang w:val="en-US"/>
         </w:rPr>
         <w:t xml:space="preserve">Alimentos = expenditure on food, </w:t>
@@ -4360,12 +4430,14 @@
           <w:numId w:val="5"/>
         </w:numPr>
         <w:rPr>
+          <w:highlight w:val="yellow"/>
           <w:lang w:val="en-US"/>
         </w:rPr>
       </w:pPr>
       <w:proofErr w:type="spellStart"/>
       <w:r>
         <w:rPr>
+          <w:highlight w:val="yellow"/>
           <w:lang w:val="en-US"/>
         </w:rPr>
         <w:t>Limpieza</w:t>
@@ -4373,6 +4445,7 @@
       <w:proofErr w:type="spellEnd"/>
       <w:r>
         <w:rPr>
+          <w:highlight w:val="yellow"/>
           <w:lang w:val="en-US"/>
         </w:rPr>
         <w:t xml:space="preserve"> = expenditure on cleaning products, </w:t>
@@ -4386,12 +4459,14 @@
           <w:numId w:val="5"/>
         </w:numPr>
         <w:rPr>
+          <w:highlight w:val="yellow"/>
           <w:lang w:val="en-US"/>
         </w:rPr>
       </w:pPr>
       <w:proofErr w:type="spellStart"/>
       <w:r>
         <w:rPr>
+          <w:highlight w:val="yellow"/>
           <w:lang w:val="en-US"/>
         </w:rPr>
         <w:t>Cuidados</w:t>
@@ -4399,6 +4474,7 @@
       <w:proofErr w:type="spellEnd"/>
       <w:r>
         <w:rPr>
+          <w:highlight w:val="yellow"/>
           <w:lang w:val="en-US"/>
         </w:rPr>
         <w:t xml:space="preserve"> = expenditure on personal care. </w:t>
@@ -4407,11 +4483,13 @@
     <w:p>
       <w:pPr>
         <w:rPr>
-          <w:lang w:val="en-US"/>
-        </w:rPr>
-      </w:pPr>
-      <w:r>
-        <w:rPr>
+          <w:highlight w:val="yellow"/>
+          <w:lang w:val="en-US"/>
+        </w:rPr>
+      </w:pPr>
+      <w:r>
+        <w:rPr>
+          <w:highlight w:val="yellow"/>
           <w:lang w:val="en-US"/>
         </w:rPr>
         <w:t xml:space="preserve">The IVA attributable to the household’s </w:t>
@@ -4419,6 +4497,7 @@
       <w:proofErr w:type="spellStart"/>
       <w:r>
         <w:rPr>
+          <w:highlight w:val="yellow"/>
           <w:lang w:val="en-US"/>
         </w:rPr>
         <w:t>disponsable</w:t>
@@ -4426,6 +4505,7 @@
       <w:proofErr w:type="spellEnd"/>
       <w:r>
         <w:rPr>
+          <w:highlight w:val="yellow"/>
           <w:lang w:val="en-US"/>
         </w:rPr>
         <w:t xml:space="preserve"> income is then computed as: </w:t>
@@ -4434,6 +4514,7 @@
     <w:p>
       <w:pPr>
         <w:rPr>
+          <w:highlight w:val="yellow"/>
           <w:lang w:val="en-US"/>
         </w:rPr>
       </w:pPr>
@@ -4442,6 +4523,7 @@
           <m:r>
             <w:rPr>
               <w:rFonts w:ascii="Cambria Math" w:hAnsi="Cambria Math"/>
+              <w:highlight w:val="yellow"/>
               <w:lang w:val="en-US"/>
             </w:rPr>
             <m:t xml:space="preserve">IVA HH A= </m:t>
@@ -4455,6 +4537,7 @@
                   <w:rPr>
                     <w:rFonts w:ascii="Cambria Math" w:hAnsi="Cambria Math"/>
                     <w:i/>
+                    <w:highlight w:val="yellow"/>
                     <w:lang w:val="en-US"/>
                   </w:rPr>
                 </w:ins>
@@ -4468,6 +4551,7 @@
                       <w:rPr>
                         <w:rFonts w:ascii="Cambria Math" w:hAnsi="Cambria Math"/>
                         <w:i/>
+                        <w:highlight w:val="yellow"/>
                         <w:lang w:val="en-US"/>
                       </w:rPr>
                     </w:ins>
@@ -4481,6 +4565,7 @@
                           <w:rPr>
                             <w:rFonts w:ascii="Cambria Math" w:hAnsi="Cambria Math"/>
                             <w:i/>
+                            <w:highlight w:val="yellow"/>
                             <w:lang w:val="en-US"/>
                           </w:rPr>
                         </w:ins>
@@ -4490,6 +4575,7 @@
                       <m:r>
                         <w:rPr>
                           <w:rFonts w:ascii="Cambria Math" w:hAnsi="Cambria Math"/>
+                          <w:highlight w:val="yellow"/>
                           <w:lang w:val="en-US"/>
                         </w:rPr>
                         <m:t>IVA HH</m:t>
@@ -4499,6 +4585,7 @@
                       <m:r>
                         <w:rPr>
                           <w:rFonts w:ascii="Cambria Math" w:hAnsi="Cambria Math"/>
+                          <w:highlight w:val="yellow"/>
                           <w:lang w:val="en-US"/>
                         </w:rPr>
                         <m:t>GASTO HH tri</m:t>
@@ -4508,6 +4595,7 @@
                   <m:r>
                     <w:rPr>
                       <w:rFonts w:ascii="Cambria Math" w:hAnsi="Cambria Math"/>
+                      <w:highlight w:val="yellow"/>
                       <w:lang w:val="en-US"/>
                     </w:rPr>
                     <m:t>*ing corr  if Gasto HH tri&gt;0</m:t>
@@ -4517,6 +4605,7 @@
                   <m:r>
                     <w:rPr>
                       <w:rFonts w:ascii="Cambria Math" w:hAnsi="Cambria Math"/>
+                      <w:highlight w:val="yellow"/>
                       <w:lang w:val="en-US"/>
                     </w:rPr>
                     <m:t xml:space="preserve">0 otherwise </m:t>
@@ -4536,6 +4625,7 @@
       </w:pPr>
       <w:r>
         <w:rPr>
+          <w:highlight w:val="yellow"/>
           <w:lang w:val="en-US"/>
         </w:rPr>
         <w:t xml:space="preserve">Where </w:t>
@@ -4543,6 +4633,7 @@
       <w:proofErr w:type="spellStart"/>
       <w:r>
         <w:rPr>
+          <w:highlight w:val="yellow"/>
           <w:lang w:val="en-US"/>
         </w:rPr>
         <w:t>ing</w:t>
@@ -4550,6 +4641,7 @@
       <w:proofErr w:type="spellEnd"/>
       <w:r>
         <w:rPr>
+          <w:highlight w:val="yellow"/>
           <w:lang w:val="en-US"/>
         </w:rPr>
         <w:t xml:space="preserve"> </w:t>
@@ -4557,6 +4649,7 @@
       <w:proofErr w:type="spellStart"/>
       <w:r>
         <w:rPr>
+          <w:highlight w:val="yellow"/>
           <w:lang w:val="en-US"/>
         </w:rPr>
         <w:t>cor</w:t>
@@ -4564,6 +4657,7 @@
       <w:proofErr w:type="spellEnd"/>
       <w:r>
         <w:rPr>
+          <w:highlight w:val="yellow"/>
           <w:lang w:val="en-US"/>
         </w:rPr>
         <w:t xml:space="preserve"> is the household’s current </w:t>
@@ -4571,6 +4665,7 @@
       <w:proofErr w:type="spellStart"/>
       <w:r>
         <w:rPr>
+          <w:highlight w:val="yellow"/>
           <w:lang w:val="en-US"/>
         </w:rPr>
         <w:t>disponsable</w:t>
@@ -4578,6 +4673,7 @@
       <w:proofErr w:type="spellEnd"/>
       <w:r>
         <w:rPr>
+          <w:highlight w:val="yellow"/>
           <w:lang w:val="en-US"/>
         </w:rPr>
         <w:t xml:space="preserve"> income (the sum of all monetary income after direct taxes and transfers, as defined in the CEQ framework). This imputation assumes that the effective Iva rate on taxable expenditure is constant across households and that the tax burden scales proportionally with </w:t>
@@ -4585,6 +4681,7 @@
       <w:proofErr w:type="spellStart"/>
       <w:r>
         <w:rPr>
+          <w:highlight w:val="yellow"/>
           <w:lang w:val="en-US"/>
         </w:rPr>
         <w:t>disponsable</w:t>
@@ -4592,9 +4689,16 @@
       <w:proofErr w:type="spellEnd"/>
       <w:r>
         <w:rPr>
-          <w:lang w:val="en-US"/>
-        </w:rPr>
-        <w:t xml:space="preserve"> income within the taxable consumption base. </w:t>
+          <w:highlight w:val="yellow"/>
+          <w:lang w:val="en-US"/>
+        </w:rPr>
+        <w:t xml:space="preserve"> income within the taxable consumption base.</w:t>
+      </w:r>
+      <w:r>
+        <w:rPr>
+          <w:lang w:val="en-US"/>
+        </w:rPr>
+        <w:t xml:space="preserve"> </w:t>
       </w:r>
     </w:p>
     <w:p>
@@ -4614,7 +4718,6 @@
       <w:pPr>
         <w:pStyle w:val="Subtitle"/>
         <w:rPr>
-          <w:rFonts w:asciiTheme="minorHAnsi" w:eastAsiaTheme="minorEastAsia" w:hAnsiTheme="minorHAnsi" w:cstheme="minorBidi"/>
           <w:lang w:val="en-US"/>
         </w:rPr>
       </w:pPr>
@@ -4625,6 +4728,20 @@
         <w:lastRenderedPageBreak/>
         <w:t xml:space="preserve">Analyzing Results </w:t>
       </w:r>
+    </w:p>
+    <w:p>
+      <w:pPr>
+        <w:rPr>
+          <w:lang w:val="en-US"/>
+        </w:rPr>
+      </w:pPr>
+    </w:p>
+    <w:p>
+      <w:pPr>
+        <w:rPr>
+          <w:lang w:val="en-US"/>
+        </w:rPr>
+      </w:pPr>
     </w:p>
     <w:p>
       <w:pPr>
@@ -6798,7 +6915,7 @@
 </file>
 
 <file path=customXml/itemProps1.xml><?xml version="1.0" encoding="utf-8"?>
-<ds:datastoreItem xmlns:ds="http://schemas.openxmlformats.org/officeDocument/2006/customXml" ds:itemID="{9D7ECA8C-A4C2-4E4D-B33F-9CE085D88A0F}">
+<ds:datastoreItem xmlns:ds="http://schemas.openxmlformats.org/officeDocument/2006/customXml" ds:itemID="{277D78F8-3372-084F-BAA1-3D236997FB76}">
   <ds:schemaRefs>
     <ds:schemaRef ds:uri="http://schemas.openxmlformats.org/officeDocument/2006/bibliography"/>
   </ds:schemaRefs>

</xml_diff>

<commit_message>
post fiscal for iva check
</commit_message>
<xml_diff>
--- a/methodology/Methodology.docx
+++ b/methodology/Methodology.docx
@@ -85,26 +85,22 @@
         <m:d>
           <m:dPr>
             <m:ctrlPr>
-              <w:ins w:id="0" w:author="JESUS ALEXIS SANCHEZ MORENO" w:date="2026-04-10T23:19:00Z" w16du:dateUtc="2026-04-11T05:19:00Z">
-                <w:rPr>
-                  <w:rFonts w:ascii="Cambria Math" w:hAnsi="Cambria Math"/>
-                  <w:i/>
-                  <w:lang w:val="en-US"/>
-                </w:rPr>
-              </w:ins>
+              <w:rPr>
+                <w:rFonts w:ascii="Cambria Math" w:hAnsi="Cambria Math"/>
+                <w:i/>
+                <w:lang w:val="en-US"/>
+              </w:rPr>
             </m:ctrlPr>
           </m:dPr>
           <m:e>
             <m:sSub>
               <m:sSubPr>
                 <m:ctrlPr>
-                  <w:ins w:id="1" w:author="JESUS ALEXIS SANCHEZ MORENO" w:date="2026-04-10T23:19:00Z" w16du:dateUtc="2026-04-11T05:19:00Z">
-                    <w:rPr>
-                      <w:rFonts w:ascii="Cambria Math" w:hAnsi="Cambria Math"/>
-                      <w:i/>
-                      <w:lang w:val="en-US"/>
-                    </w:rPr>
-                  </w:ins>
+                  <w:rPr>
+                    <w:rFonts w:ascii="Cambria Math" w:hAnsi="Cambria Math"/>
+                    <w:i/>
+                    <w:lang w:val="en-US"/>
+                  </w:rPr>
                 </m:ctrlPr>
               </m:sSubPr>
               <m:e>
@@ -139,48 +135,20 @@
         <w:rPr>
           <w:lang w:val="en-US"/>
         </w:rPr>
-        <w:t xml:space="preserve">Since the National Survey of </w:t>
-      </w:r>
-      <w:proofErr w:type="spellStart"/>
-      <w:r>
-        <w:rPr>
-          <w:lang w:val="en-US"/>
-        </w:rPr>
-        <w:t>Househols</w:t>
-      </w:r>
-      <w:proofErr w:type="spellEnd"/>
-      <w:r>
-        <w:rPr>
-          <w:lang w:val="en-US"/>
-        </w:rPr>
-        <w:t xml:space="preserve"> Income Expenditures (ENIGH) reports income net of taxes, a “gross-up” procedure is required to estimate the pre-tax income for formal workers (category P001: Wages and Salaries) </w:t>
-      </w:r>
-    </w:p>
-    <w:p>
-      <w:pPr>
-        <w:rPr>
-          <w:lang w:val="en-US"/>
-        </w:rPr>
-      </w:pPr>
-      <w:r>
-        <w:rPr>
-          <w:lang w:val="en-US"/>
-        </w:rPr>
-        <w:t xml:space="preserve">Gross income is recovered form observed net income using progressive tax schedule established by the Servicio de Administración </w:t>
-      </w:r>
-      <w:proofErr w:type="spellStart"/>
-      <w:r>
-        <w:rPr>
-          <w:lang w:val="en-US"/>
-        </w:rPr>
-        <w:t>Tributaria</w:t>
-      </w:r>
-      <w:proofErr w:type="spellEnd"/>
-      <w:r>
-        <w:rPr>
-          <w:lang w:val="en-US"/>
-        </w:rPr>
-        <w:t xml:space="preserve"> for fiscal year 2024. </w:t>
+        <w:t xml:space="preserve">Since the National Survey of Househols Income Expenditures (ENIGH) reports income net of taxes, a “gross-up” procedure is required to estimate the pre-tax income for formal workers (category P001: Wages and Salaries) </w:t>
+      </w:r>
+    </w:p>
+    <w:p>
+      <w:pPr>
+        <w:rPr>
+          <w:lang w:val="en-US"/>
+        </w:rPr>
+      </w:pPr>
+      <w:r>
+        <w:rPr>
+          <w:lang w:val="en-US"/>
+        </w:rPr>
+        <w:t xml:space="preserve">Gross income is recovered form observed net income using progressive tax schedule established by the Servicio de Administración Tributaria for fiscal year 2024. </w:t>
       </w:r>
       <w:r>
         <w:rPr>
@@ -259,13 +227,11 @@
         <m:sSub>
           <m:sSubPr>
             <m:ctrlPr>
-              <w:ins w:id="2" w:author="JESUS ALEXIS SANCHEZ MORENO" w:date="2026-04-11T00:01:00Z" w16du:dateUtc="2026-04-11T06:01:00Z">
-                <w:rPr>
-                  <w:rFonts w:ascii="Cambria Math" w:hAnsi="Cambria Math"/>
-                  <w:i/>
-                  <w:lang w:val="en-US"/>
-                </w:rPr>
-              </w:ins>
+              <w:rPr>
+                <w:rFonts w:ascii="Cambria Math" w:hAnsi="Cambria Math"/>
+                <w:i/>
+                <w:lang w:val="en-US"/>
+              </w:rPr>
             </m:ctrlPr>
           </m:sSubPr>
           <m:e>
@@ -305,13 +271,11 @@
         <m:sSub>
           <m:sSubPr>
             <m:ctrlPr>
-              <w:ins w:id="3" w:author="JESUS ALEXIS SANCHEZ MORENO" w:date="2026-04-11T00:02:00Z" w16du:dateUtc="2026-04-11T06:02:00Z">
-                <w:rPr>
-                  <w:rFonts w:ascii="Cambria Math" w:hAnsi="Cambria Math"/>
-                  <w:i/>
-                  <w:lang w:val="en-US"/>
-                </w:rPr>
-              </w:ins>
+              <w:rPr>
+                <w:rFonts w:ascii="Cambria Math" w:hAnsi="Cambria Math"/>
+                <w:i/>
+                <w:lang w:val="en-US"/>
+              </w:rPr>
             </m:ctrlPr>
           </m:sSubPr>
           <m:e>
@@ -358,13 +322,11 @@
         <m:sSub>
           <m:sSubPr>
             <m:ctrlPr>
-              <w:ins w:id="4" w:author="JESUS ALEXIS SANCHEZ MORENO" w:date="2026-04-11T00:03:00Z" w16du:dateUtc="2026-04-11T06:03:00Z">
-                <w:rPr>
-                  <w:rFonts w:ascii="Cambria Math" w:hAnsi="Cambria Math"/>
-                  <w:i/>
-                  <w:lang w:val="en-US"/>
-                </w:rPr>
-              </w:ins>
+              <w:rPr>
+                <w:rFonts w:ascii="Cambria Math" w:hAnsi="Cambria Math"/>
+                <w:i/>
+                <w:lang w:val="en-US"/>
+              </w:rPr>
             </m:ctrlPr>
           </m:sSubPr>
           <m:e>
@@ -404,13 +366,11 @@
         <m:sSub>
           <m:sSubPr>
             <m:ctrlPr>
-              <w:ins w:id="5" w:author="JESUS ALEXIS SANCHEZ MORENO" w:date="2026-04-11T00:03:00Z" w16du:dateUtc="2026-04-11T06:03:00Z">
-                <w:rPr>
-                  <w:rFonts w:ascii="Cambria Math" w:hAnsi="Cambria Math"/>
-                  <w:i/>
-                  <w:lang w:val="en-US"/>
-                </w:rPr>
-              </w:ins>
+              <w:rPr>
+                <w:rFonts w:ascii="Cambria Math" w:hAnsi="Cambria Math"/>
+                <w:i/>
+                <w:lang w:val="en-US"/>
+              </w:rPr>
             </m:ctrlPr>
           </m:sSubPr>
           <m:e>
@@ -1220,49 +1180,7 @@
         <w:rPr>
           <w:lang w:val="en-US"/>
         </w:rPr>
-        <w:t xml:space="preserve">Source: Own elaboration with </w:t>
-      </w:r>
-      <w:proofErr w:type="spellStart"/>
-      <w:r>
-        <w:rPr>
-          <w:lang w:val="en-US"/>
-        </w:rPr>
-        <w:t>Servicios</w:t>
-      </w:r>
-      <w:proofErr w:type="spellEnd"/>
-      <w:r>
-        <w:rPr>
-          <w:lang w:val="en-US"/>
-        </w:rPr>
-        <w:t xml:space="preserve"> de </w:t>
-      </w:r>
-      <w:proofErr w:type="spellStart"/>
-      <w:r>
-        <w:rPr>
-          <w:lang w:val="en-US"/>
-        </w:rPr>
-        <w:t>Administracion</w:t>
-      </w:r>
-      <w:proofErr w:type="spellEnd"/>
-      <w:r>
-        <w:rPr>
-          <w:lang w:val="en-US"/>
-        </w:rPr>
-        <w:t xml:space="preserve"> </w:t>
-      </w:r>
-      <w:proofErr w:type="spellStart"/>
-      <w:r>
-        <w:rPr>
-          <w:lang w:val="en-US"/>
-        </w:rPr>
-        <w:t>Tributaria</w:t>
-      </w:r>
-      <w:proofErr w:type="spellEnd"/>
-      <w:r>
-        <w:rPr>
-          <w:lang w:val="en-US"/>
-        </w:rPr>
-        <w:t xml:space="preserve"> data. </w:t>
+        <w:t xml:space="preserve">Source: Own elaboration with Servicios de Administracion Tributaria data. </w:t>
       </w:r>
     </w:p>
     <w:p>
@@ -1304,13 +1222,11 @@
           <m:sSub>
             <m:sSubPr>
               <m:ctrlPr>
-                <w:ins w:id="6" w:author="JESUS ALEXIS SANCHEZ MORENO" w:date="2026-04-11T00:09:00Z" w16du:dateUtc="2026-04-11T06:09:00Z">
-                  <w:rPr>
-                    <w:rFonts w:ascii="Cambria Math" w:hAnsi="Cambria Math"/>
-                    <w:i/>
-                    <w:lang w:val="en-US"/>
-                  </w:rPr>
-                </w:ins>
+                <w:rPr>
+                  <w:rFonts w:ascii="Cambria Math" w:hAnsi="Cambria Math"/>
+                  <w:i/>
+                  <w:lang w:val="en-US"/>
+                </w:rPr>
               </m:ctrlPr>
             </m:sSubPr>
             <m:e>
@@ -1335,13 +1251,11 @@
           <m:d>
             <m:dPr>
               <m:ctrlPr>
-                <w:ins w:id="7" w:author="JESUS ALEXIS SANCHEZ MORENO" w:date="2026-04-11T00:09:00Z" w16du:dateUtc="2026-04-11T06:09:00Z">
-                  <w:rPr>
-                    <w:rFonts w:ascii="Cambria Math" w:hAnsi="Cambria Math"/>
-                    <w:i/>
-                    <w:lang w:val="en-US"/>
-                  </w:rPr>
-                </w:ins>
+                <w:rPr>
+                  <w:rFonts w:ascii="Cambria Math" w:hAnsi="Cambria Math"/>
+                  <w:i/>
+                  <w:lang w:val="en-US"/>
+                </w:rPr>
               </m:ctrlPr>
             </m:dPr>
             <m:e>
@@ -1364,13 +1278,11 @@
           <m:sSub>
             <m:sSubPr>
               <m:ctrlPr>
-                <w:ins w:id="8" w:author="JESUS ALEXIS SANCHEZ MORENO" w:date="2026-04-11T00:09:00Z" w16du:dateUtc="2026-04-11T06:09:00Z">
-                  <w:rPr>
-                    <w:rFonts w:ascii="Cambria Math" w:hAnsi="Cambria Math"/>
-                    <w:i/>
-                    <w:lang w:val="en-US"/>
-                  </w:rPr>
-                </w:ins>
+                <w:rPr>
+                  <w:rFonts w:ascii="Cambria Math" w:hAnsi="Cambria Math"/>
+                  <w:i/>
+                  <w:lang w:val="en-US"/>
+                </w:rPr>
               </m:ctrlPr>
             </m:sSubPr>
             <m:e>
@@ -1402,13 +1314,11 @@
           <m:sSub>
             <m:sSubPr>
               <m:ctrlPr>
-                <w:ins w:id="9" w:author="JESUS ALEXIS SANCHEZ MORENO" w:date="2026-04-11T00:09:00Z" w16du:dateUtc="2026-04-11T06:09:00Z">
-                  <w:rPr>
-                    <w:rFonts w:ascii="Cambria Math" w:hAnsi="Cambria Math"/>
-                    <w:i/>
-                    <w:lang w:val="en-US"/>
-                  </w:rPr>
-                </w:ins>
+                <w:rPr>
+                  <w:rFonts w:ascii="Cambria Math" w:hAnsi="Cambria Math"/>
+                  <w:i/>
+                  <w:lang w:val="en-US"/>
+                </w:rPr>
               </m:ctrlPr>
             </m:sSubPr>
             <m:e>
@@ -1433,13 +1343,11 @@
           <m:d>
             <m:dPr>
               <m:ctrlPr>
-                <w:ins w:id="10" w:author="JESUS ALEXIS SANCHEZ MORENO" w:date="2026-04-11T00:09:00Z" w16du:dateUtc="2026-04-11T06:09:00Z">
-                  <w:rPr>
-                    <w:rFonts w:ascii="Cambria Math" w:hAnsi="Cambria Math"/>
-                    <w:i/>
-                    <w:lang w:val="en-US"/>
-                  </w:rPr>
-                </w:ins>
+                <w:rPr>
+                  <w:rFonts w:ascii="Cambria Math" w:hAnsi="Cambria Math"/>
+                  <w:i/>
+                  <w:lang w:val="en-US"/>
+                </w:rPr>
               </m:ctrlPr>
             </m:dPr>
             <m:e>
@@ -1453,13 +1361,11 @@
               <m:sSub>
                 <m:sSubPr>
                   <m:ctrlPr>
-                    <w:ins w:id="11" w:author="JESUS ALEXIS SANCHEZ MORENO" w:date="2026-04-11T00:09:00Z" w16du:dateUtc="2026-04-11T06:09:00Z">
-                      <w:rPr>
-                        <w:rFonts w:ascii="Cambria Math" w:hAnsi="Cambria Math"/>
-                        <w:i/>
-                        <w:lang w:val="en-US"/>
-                      </w:rPr>
-                    </w:ins>
+                    <w:rPr>
+                      <w:rFonts w:ascii="Cambria Math" w:hAnsi="Cambria Math"/>
+                      <w:i/>
+                      <w:lang w:val="en-US"/>
+                    </w:rPr>
                   </m:ctrlPr>
                 </m:sSubPr>
                 <m:e>
@@ -1510,13 +1416,11 @@
           <m:sSub>
             <m:sSubPr>
               <m:ctrlPr>
-                <w:ins w:id="12" w:author="JESUS ALEXIS SANCHEZ MORENO" w:date="2026-04-11T00:10:00Z" w16du:dateUtc="2026-04-11T06:10:00Z">
-                  <w:rPr>
-                    <w:rFonts w:ascii="Cambria Math" w:hAnsi="Cambria Math"/>
-                    <w:i/>
-                    <w:lang w:val="en-US"/>
-                  </w:rPr>
-                </w:ins>
+                <w:rPr>
+                  <w:rFonts w:ascii="Cambria Math" w:hAnsi="Cambria Math"/>
+                  <w:i/>
+                  <w:lang w:val="en-US"/>
+                </w:rPr>
               </m:ctrlPr>
             </m:sSubPr>
             <m:e>
@@ -1541,13 +1445,11 @@
           <m:d>
             <m:dPr>
               <m:ctrlPr>
-                <w:ins w:id="13" w:author="JESUS ALEXIS SANCHEZ MORENO" w:date="2026-04-11T00:10:00Z" w16du:dateUtc="2026-04-11T06:10:00Z">
-                  <w:rPr>
-                    <w:rFonts w:ascii="Cambria Math" w:hAnsi="Cambria Math"/>
-                    <w:i/>
-                    <w:lang w:val="en-US"/>
-                  </w:rPr>
-                </w:ins>
+                <w:rPr>
+                  <w:rFonts w:ascii="Cambria Math" w:hAnsi="Cambria Math"/>
+                  <w:i/>
+                  <w:lang w:val="en-US"/>
+                </w:rPr>
               </m:ctrlPr>
             </m:dPr>
             <m:e>
@@ -1570,13 +1472,11 @@
           <m:d>
             <m:dPr>
               <m:ctrlPr>
-                <w:ins w:id="14" w:author="JESUS ALEXIS SANCHEZ MORENO" w:date="2026-04-11T00:10:00Z" w16du:dateUtc="2026-04-11T06:10:00Z">
-                  <w:rPr>
-                    <w:rFonts w:ascii="Cambria Math" w:hAnsi="Cambria Math"/>
-                    <w:i/>
-                    <w:lang w:val="en-US"/>
-                  </w:rPr>
-                </w:ins>
+                <w:rPr>
+                  <w:rFonts w:ascii="Cambria Math" w:hAnsi="Cambria Math"/>
+                  <w:i/>
+                  <w:lang w:val="en-US"/>
+                </w:rPr>
               </m:ctrlPr>
             </m:dPr>
             <m:e>
@@ -1590,13 +1490,11 @@
               <m:sSub>
                 <m:sSubPr>
                   <m:ctrlPr>
-                    <w:ins w:id="15" w:author="JESUS ALEXIS SANCHEZ MORENO" w:date="2026-04-11T00:10:00Z" w16du:dateUtc="2026-04-11T06:10:00Z">
-                      <w:rPr>
-                        <w:rFonts w:ascii="Cambria Math" w:hAnsi="Cambria Math"/>
-                        <w:i/>
-                        <w:lang w:val="en-US"/>
-                      </w:rPr>
-                    </w:ins>
+                    <w:rPr>
+                      <w:rFonts w:ascii="Cambria Math" w:hAnsi="Cambria Math"/>
+                      <w:i/>
+                      <w:lang w:val="en-US"/>
+                    </w:rPr>
                   </m:ctrlPr>
                 </m:sSubPr>
                 <m:e>
@@ -1630,13 +1528,11 @@
           <m:sSub>
             <m:sSubPr>
               <m:ctrlPr>
-                <w:ins w:id="16" w:author="JESUS ALEXIS SANCHEZ MORENO" w:date="2026-04-11T00:10:00Z" w16du:dateUtc="2026-04-11T06:10:00Z">
-                  <w:rPr>
-                    <w:rFonts w:ascii="Cambria Math" w:hAnsi="Cambria Math"/>
-                    <w:i/>
-                    <w:lang w:val="en-US"/>
-                  </w:rPr>
-                </w:ins>
+                <w:rPr>
+                  <w:rFonts w:ascii="Cambria Math" w:hAnsi="Cambria Math"/>
+                  <w:i/>
+                  <w:lang w:val="en-US"/>
+                </w:rPr>
               </m:ctrlPr>
             </m:sSubPr>
             <m:e>
@@ -1668,13 +1564,11 @@
           <m:sSub>
             <m:sSubPr>
               <m:ctrlPr>
-                <w:ins w:id="17" w:author="JESUS ALEXIS SANCHEZ MORENO" w:date="2026-04-11T00:10:00Z" w16du:dateUtc="2026-04-11T06:10:00Z">
-                  <w:rPr>
-                    <w:rFonts w:ascii="Cambria Math" w:hAnsi="Cambria Math"/>
-                    <w:i/>
-                    <w:lang w:val="en-US"/>
-                  </w:rPr>
-                </w:ins>
+                <w:rPr>
+                  <w:rFonts w:ascii="Cambria Math" w:hAnsi="Cambria Math"/>
+                  <w:i/>
+                  <w:lang w:val="en-US"/>
+                </w:rPr>
               </m:ctrlPr>
             </m:sSubPr>
             <m:e>
@@ -1706,13 +1600,11 @@
           <m:sSub>
             <m:sSubPr>
               <m:ctrlPr>
-                <w:ins w:id="18" w:author="JESUS ALEXIS SANCHEZ MORENO" w:date="2026-04-11T00:10:00Z" w16du:dateUtc="2026-04-11T06:10:00Z">
-                  <w:rPr>
-                    <w:rFonts w:ascii="Cambria Math" w:hAnsi="Cambria Math"/>
-                    <w:i/>
-                    <w:lang w:val="en-US"/>
-                  </w:rPr>
-                </w:ins>
+                <w:rPr>
+                  <w:rFonts w:ascii="Cambria Math" w:hAnsi="Cambria Math"/>
+                  <w:i/>
+                  <w:lang w:val="en-US"/>
+                </w:rPr>
               </m:ctrlPr>
             </m:sSubPr>
             <m:e>
@@ -1760,13 +1652,11 @@
         <m:sSub>
           <m:sSubPr>
             <m:ctrlPr>
-              <w:ins w:id="19" w:author="JESUS ALEXIS SANCHEZ MORENO" w:date="2026-04-11T00:10:00Z" w16du:dateUtc="2026-04-11T06:10:00Z">
-                <w:rPr>
-                  <w:rFonts w:ascii="Cambria Math" w:hAnsi="Cambria Math"/>
-                  <w:i/>
-                  <w:lang w:val="en-US"/>
-                </w:rPr>
-              </w:ins>
+              <w:rPr>
+                <w:rFonts w:ascii="Cambria Math" w:hAnsi="Cambria Math"/>
+                <w:i/>
+                <w:lang w:val="en-US"/>
+              </w:rPr>
             </m:ctrlPr>
           </m:sSubPr>
           <m:e>
@@ -1813,13 +1703,11 @@
         <m:sSub>
           <m:sSubPr>
             <m:ctrlPr>
-              <w:ins w:id="20" w:author="JESUS ALEXIS SANCHEZ MORENO" w:date="2026-04-11T00:11:00Z" w16du:dateUtc="2026-04-11T06:11:00Z">
-                <w:rPr>
-                  <w:rFonts w:ascii="Cambria Math" w:hAnsi="Cambria Math"/>
-                  <w:i/>
-                  <w:lang w:val="en-US"/>
-                </w:rPr>
-              </w:ins>
+              <w:rPr>
+                <w:rFonts w:ascii="Cambria Math" w:hAnsi="Cambria Math"/>
+                <w:i/>
+                <w:lang w:val="en-US"/>
+              </w:rPr>
             </m:ctrlPr>
           </m:sSubPr>
           <m:e>
@@ -1859,13 +1747,11 @@
         <m:sSub>
           <m:sSubPr>
             <m:ctrlPr>
-              <w:ins w:id="21" w:author="JESUS ALEXIS SANCHEZ MORENO" w:date="2026-04-11T00:11:00Z" w16du:dateUtc="2026-04-11T06:11:00Z">
-                <w:rPr>
-                  <w:rFonts w:ascii="Cambria Math" w:hAnsi="Cambria Math"/>
-                  <w:i/>
-                  <w:lang w:val="en-US"/>
-                </w:rPr>
-              </w:ins>
+              <w:rPr>
+                <w:rFonts w:ascii="Cambria Math" w:hAnsi="Cambria Math"/>
+                <w:i/>
+                <w:lang w:val="en-US"/>
+              </w:rPr>
             </m:ctrlPr>
           </m:sSubPr>
           <m:e>
@@ -1994,21 +1880,7 @@
         <w:rPr>
           <w:lang w:val="en-US"/>
         </w:rPr>
-        <w:t xml:space="preserve">To operationalize the </w:t>
-      </w:r>
-      <w:proofErr w:type="spellStart"/>
-      <w:r>
-        <w:rPr>
-          <w:lang w:val="en-US"/>
-        </w:rPr>
-        <w:t>invesion</w:t>
-      </w:r>
-      <w:proofErr w:type="spellEnd"/>
-      <w:r>
-        <w:rPr>
-          <w:lang w:val="en-US"/>
-        </w:rPr>
-        <w:t xml:space="preserve">, gross income is computed analytically within each bracket by solving the linear expression for </w:t>
+        <w:t xml:space="preserve">To operationalize the invesion, gross income is computed analytically within each bracket by solving the linear expression for </w:t>
       </w:r>
       <m:oMath>
         <m:r>
@@ -2067,30 +1939,26 @@
           <m:sSup>
             <m:sSupPr>
               <m:ctrlPr>
-                <w:ins w:id="22" w:author="Unknown" w:date="2026-04-10T21:20:00Z" w16du:dateUtc="2026-04-11T03:20:00Z">
-                  <w:rPr>
-                    <w:rFonts w:ascii="Cambria Math" w:hAnsi="Cambria Math"/>
-                    <w:i/>
-                    <w:kern w:val="2"/>
-                    <w:sz w:val="24"/>
-                    <w:szCs w:val="24"/>
-                    <w:lang w:val="en-US"/>
-                    <w14:ligatures w14:val="standardContextual"/>
-                  </w:rPr>
-                </w:ins>
+                <w:rPr>
+                  <w:rFonts w:ascii="Cambria Math" w:hAnsi="Cambria Math"/>
+                  <w:i/>
+                  <w:kern w:val="2"/>
+                  <w:sz w:val="24"/>
+                  <w:szCs w:val="24"/>
+                  <w:lang w:val="en-US"/>
+                  <w14:ligatures w14:val="standardContextual"/>
+                </w:rPr>
               </m:ctrlPr>
             </m:sSupPr>
             <m:e>
               <m:sSub>
                 <m:sSubPr>
                   <m:ctrlPr>
-                    <w:ins w:id="23" w:author="JESUS ALEXIS SANCHEZ MORENO" w:date="2026-04-11T00:25:00Z" w16du:dateUtc="2026-04-11T06:25:00Z">
-                      <w:rPr>
-                        <w:rFonts w:ascii="Cambria Math" w:hAnsi="Cambria Math"/>
-                        <w:i/>
-                        <w:lang w:val="en-US"/>
-                      </w:rPr>
-                    </w:ins>
+                    <w:rPr>
+                      <w:rFonts w:ascii="Cambria Math" w:hAnsi="Cambria Math"/>
+                      <w:i/>
+                      <w:lang w:val="en-US"/>
+                    </w:rPr>
                   </m:ctrlPr>
                 </m:sSubPr>
                 <m:e>
@@ -2133,13 +2001,11 @@
           <m:f>
             <m:fPr>
               <m:ctrlPr>
-                <w:ins w:id="24" w:author="JESUS ALEXIS SANCHEZ MORENO" w:date="2026-04-11T00:26:00Z" w16du:dateUtc="2026-04-11T06:26:00Z">
-                  <w:rPr>
-                    <w:rFonts w:ascii="Cambria Math" w:hAnsi="Cambria Math"/>
-                    <w:i/>
-                    <w:lang w:val="en-US"/>
-                  </w:rPr>
-                </w:ins>
+                <w:rPr>
+                  <w:rFonts w:ascii="Cambria Math" w:hAnsi="Cambria Math"/>
+                  <w:i/>
+                  <w:lang w:val="en-US"/>
+                </w:rPr>
               </m:ctrlPr>
             </m:fPr>
             <m:num>
@@ -2153,13 +2019,11 @@
               <m:sSub>
                 <m:sSubPr>
                   <m:ctrlPr>
-                    <w:ins w:id="25" w:author="JESUS ALEXIS SANCHEZ MORENO" w:date="2026-04-11T00:26:00Z" w16du:dateUtc="2026-04-11T06:26:00Z">
-                      <w:rPr>
-                        <w:rFonts w:ascii="Cambria Math" w:hAnsi="Cambria Math"/>
-                        <w:i/>
-                        <w:lang w:val="en-US"/>
-                      </w:rPr>
-                    </w:ins>
+                    <w:rPr>
+                      <w:rFonts w:ascii="Cambria Math" w:hAnsi="Cambria Math"/>
+                      <w:i/>
+                      <w:lang w:val="en-US"/>
+                    </w:rPr>
                   </m:ctrlPr>
                 </m:sSubPr>
                 <m:e>
@@ -2191,13 +2055,11 @@
               <m:sSub>
                 <m:sSubPr>
                   <m:ctrlPr>
-                    <w:ins w:id="26" w:author="JESUS ALEXIS SANCHEZ MORENO" w:date="2026-04-11T00:26:00Z" w16du:dateUtc="2026-04-11T06:26:00Z">
-                      <w:rPr>
-                        <w:rFonts w:ascii="Cambria Math" w:hAnsi="Cambria Math"/>
-                        <w:i/>
-                        <w:lang w:val="en-US"/>
-                      </w:rPr>
-                    </w:ins>
+                    <w:rPr>
+                      <w:rFonts w:ascii="Cambria Math" w:hAnsi="Cambria Math"/>
+                      <w:i/>
+                      <w:lang w:val="en-US"/>
+                    </w:rPr>
                   </m:ctrlPr>
                 </m:sSubPr>
                 <m:e>
@@ -2229,13 +2091,11 @@
               <m:sSub>
                 <m:sSubPr>
                   <m:ctrlPr>
-                    <w:ins w:id="27" w:author="JESUS ALEXIS SANCHEZ MORENO" w:date="2026-04-11T00:26:00Z" w16du:dateUtc="2026-04-11T06:26:00Z">
-                      <w:rPr>
-                        <w:rFonts w:ascii="Cambria Math" w:hAnsi="Cambria Math"/>
-                        <w:i/>
-                        <w:lang w:val="en-US"/>
-                      </w:rPr>
-                    </w:ins>
+                    <w:rPr>
+                      <w:rFonts w:ascii="Cambria Math" w:hAnsi="Cambria Math"/>
+                      <w:i/>
+                      <w:lang w:val="en-US"/>
+                    </w:rPr>
                   </m:ctrlPr>
                 </m:sSubPr>
                 <m:e>
@@ -2269,13 +2129,11 @@
               <m:sSub>
                 <m:sSubPr>
                   <m:ctrlPr>
-                    <w:ins w:id="28" w:author="JESUS ALEXIS SANCHEZ MORENO" w:date="2026-04-11T00:26:00Z" w16du:dateUtc="2026-04-11T06:26:00Z">
-                      <w:rPr>
-                        <w:rFonts w:ascii="Cambria Math" w:hAnsi="Cambria Math"/>
-                        <w:i/>
-                        <w:lang w:val="en-US"/>
-                      </w:rPr>
-                    </w:ins>
+                    <w:rPr>
+                      <w:rFonts w:ascii="Cambria Math" w:hAnsi="Cambria Math"/>
+                      <w:i/>
+                      <w:lang w:val="en-US"/>
+                    </w:rPr>
                   </m:ctrlPr>
                 </m:sSubPr>
                 <m:e>
@@ -2393,17 +2251,15 @@
         <m:sSubSup>
           <m:sSubSupPr>
             <m:ctrlPr>
-              <w:ins w:id="29" w:author="Unknown" w:date="2026-04-10T21:20:00Z" w16du:dateUtc="2026-04-11T03:20:00Z">
-                <w:rPr>
-                  <w:rFonts w:ascii="Cambria Math" w:hAnsi="Cambria Math"/>
-                  <w:i/>
-                  <w:kern w:val="2"/>
-                  <w:sz w:val="24"/>
-                  <w:szCs w:val="24"/>
-                  <w:lang w:val="en-US"/>
-                  <w14:ligatures w14:val="standardContextual"/>
-                </w:rPr>
-              </w:ins>
+              <w:rPr>
+                <w:rFonts w:ascii="Cambria Math" w:hAnsi="Cambria Math"/>
+                <w:i/>
+                <w:kern w:val="2"/>
+                <w:sz w:val="24"/>
+                <w:szCs w:val="24"/>
+                <w:lang w:val="en-US"/>
+                <w14:ligatures w14:val="standardContextual"/>
+              </w:rPr>
             </m:ctrlPr>
           </m:sSubSupPr>
           <m:e>
@@ -2412,25 +2268,16 @@
                 <w:rFonts w:ascii="Cambria Math" w:hAnsi="Cambria Math"/>
                 <w:lang w:val="en-US"/>
               </w:rPr>
-              <m:t>{</m:t>
-            </m:r>
-            <m:r>
-              <w:rPr>
-                <w:rFonts w:ascii="Cambria Math" w:hAnsi="Cambria Math"/>
-                <w:lang w:val="en-US"/>
-              </w:rPr>
-              <m:t>L</m:t>
+              <m:t>{L</m:t>
             </m:r>
             <m:sSub>
               <m:sSubPr>
                 <m:ctrlPr>
-                  <w:ins w:id="30" w:author="JESUS ALEXIS SANCHEZ MORENO" w:date="2026-04-11T00:29:00Z" w16du:dateUtc="2026-04-11T06:29:00Z">
-                    <w:rPr>
-                      <w:rFonts w:ascii="Cambria Math" w:hAnsi="Cambria Math"/>
-                      <w:i/>
-                      <w:lang w:val="en-US"/>
-                    </w:rPr>
-                  </w:ins>
+                  <w:rPr>
+                    <w:rFonts w:ascii="Cambria Math" w:hAnsi="Cambria Math"/>
+                    <w:i/>
+                    <w:lang w:val="en-US"/>
+                  </w:rPr>
                 </m:ctrlPr>
               </m:sSubPr>
               <m:e>
@@ -2462,13 +2309,11 @@
             <m:sSub>
               <m:sSubPr>
                 <m:ctrlPr>
-                  <w:ins w:id="31" w:author="JESUS ALEXIS SANCHEZ MORENO" w:date="2026-04-11T00:29:00Z" w16du:dateUtc="2026-04-11T06:29:00Z">
-                    <w:rPr>
-                      <w:rFonts w:ascii="Cambria Math" w:hAnsi="Cambria Math"/>
-                      <w:i/>
-                      <w:lang w:val="en-US"/>
-                    </w:rPr>
-                  </w:ins>
+                  <w:rPr>
+                    <w:rFonts w:ascii="Cambria Math" w:hAnsi="Cambria Math"/>
+                    <w:i/>
+                    <w:lang w:val="en-US"/>
+                  </w:rPr>
                 </m:ctrlPr>
               </m:sSubPr>
               <m:e>
@@ -2500,13 +2345,11 @@
             <m:sSub>
               <m:sSubPr>
                 <m:ctrlPr>
-                  <w:ins w:id="32" w:author="JESUS ALEXIS SANCHEZ MORENO" w:date="2026-04-11T00:29:00Z" w16du:dateUtc="2026-04-11T06:29:00Z">
-                    <w:rPr>
-                      <w:rFonts w:ascii="Cambria Math" w:hAnsi="Cambria Math"/>
-                      <w:i/>
-                      <w:lang w:val="en-US"/>
-                    </w:rPr>
-                  </w:ins>
+                  <w:rPr>
+                    <w:rFonts w:ascii="Cambria Math" w:hAnsi="Cambria Math"/>
+                    <w:i/>
+                    <w:lang w:val="en-US"/>
+                  </w:rPr>
                 </m:ctrlPr>
               </m:sSubPr>
               <m:e>
@@ -2538,13 +2381,11 @@
             <m:sSub>
               <m:sSubPr>
                 <m:ctrlPr>
-                  <w:ins w:id="33" w:author="JESUS ALEXIS SANCHEZ MORENO" w:date="2026-04-11T00:29:00Z" w16du:dateUtc="2026-04-11T06:29:00Z">
-                    <w:rPr>
-                      <w:rFonts w:ascii="Cambria Math" w:hAnsi="Cambria Math"/>
-                      <w:i/>
-                      <w:lang w:val="en-US"/>
-                    </w:rPr>
-                  </w:ins>
+                  <w:rPr>
+                    <w:rFonts w:ascii="Cambria Math" w:hAnsi="Cambria Math"/>
+                    <w:i/>
+                    <w:lang w:val="en-US"/>
+                  </w:rPr>
                 </m:ctrlPr>
               </m:sSubPr>
               <m:e>
@@ -2652,26 +2493,22 @@
           <m:sSup>
             <m:sSupPr>
               <m:ctrlPr>
-                <w:ins w:id="34" w:author="Unknown" w:date="2026-04-10T21:20:00Z" w16du:dateUtc="2026-04-11T03:20:00Z">
-                  <w:rPr>
-                    <w:rFonts w:ascii="Cambria Math" w:hAnsi="Cambria Math"/>
-                    <w:i/>
-                    <w:lang w:val="en-US"/>
-                  </w:rPr>
-                </w:ins>
+                <w:rPr>
+                  <w:rFonts w:ascii="Cambria Math" w:hAnsi="Cambria Math"/>
+                  <w:i/>
+                  <w:lang w:val="en-US"/>
+                </w:rPr>
               </m:ctrlPr>
             </m:sSupPr>
             <m:e>
               <m:sSub>
                 <m:sSubPr>
                   <m:ctrlPr>
-                    <w:ins w:id="35" w:author="JESUS ALEXIS SANCHEZ MORENO" w:date="2026-04-11T00:25:00Z" w16du:dateUtc="2026-04-11T06:25:00Z">
-                      <w:rPr>
-                        <w:rFonts w:ascii="Cambria Math" w:hAnsi="Cambria Math"/>
-                        <w:i/>
-                        <w:lang w:val="en-US"/>
-                      </w:rPr>
-                    </w:ins>
+                    <w:rPr>
+                      <w:rFonts w:ascii="Cambria Math" w:hAnsi="Cambria Math"/>
+                      <w:i/>
+                      <w:lang w:val="en-US"/>
+                    </w:rPr>
                   </m:ctrlPr>
                 </m:sSubPr>
                 <m:e>
@@ -2714,13 +2551,11 @@
           <m:f>
             <m:fPr>
               <m:ctrlPr>
-                <w:ins w:id="36" w:author="JESUS ALEXIS SANCHEZ MORENO" w:date="2026-04-11T00:26:00Z" w16du:dateUtc="2026-04-11T06:26:00Z">
-                  <w:rPr>
-                    <w:rFonts w:ascii="Cambria Math" w:hAnsi="Cambria Math"/>
-                    <w:i/>
-                    <w:lang w:val="en-US"/>
-                  </w:rPr>
-                </w:ins>
+                <w:rPr>
+                  <w:rFonts w:ascii="Cambria Math" w:hAnsi="Cambria Math"/>
+                  <w:i/>
+                  <w:lang w:val="en-US"/>
+                </w:rPr>
               </m:ctrlPr>
             </m:fPr>
             <m:num>
@@ -2734,13 +2569,11 @@
               <m:sSub>
                 <m:sSubPr>
                   <m:ctrlPr>
-                    <w:ins w:id="37" w:author="JESUS ALEXIS SANCHEZ MORENO" w:date="2026-04-11T00:26:00Z" w16du:dateUtc="2026-04-11T06:26:00Z">
-                      <w:rPr>
-                        <w:rFonts w:ascii="Cambria Math" w:hAnsi="Cambria Math"/>
-                        <w:i/>
-                        <w:lang w:val="en-US"/>
-                      </w:rPr>
-                    </w:ins>
+                    <w:rPr>
+                      <w:rFonts w:ascii="Cambria Math" w:hAnsi="Cambria Math"/>
+                      <w:i/>
+                      <w:lang w:val="en-US"/>
+                    </w:rPr>
                   </m:ctrlPr>
                 </m:sSubPr>
                 <m:e>
@@ -2772,13 +2605,11 @@
               <m:sSub>
                 <m:sSubPr>
                   <m:ctrlPr>
-                    <w:ins w:id="38" w:author="JESUS ALEXIS SANCHEZ MORENO" w:date="2026-04-11T00:26:00Z" w16du:dateUtc="2026-04-11T06:26:00Z">
-                      <w:rPr>
-                        <w:rFonts w:ascii="Cambria Math" w:hAnsi="Cambria Math"/>
-                        <w:i/>
-                        <w:lang w:val="en-US"/>
-                      </w:rPr>
-                    </w:ins>
+                    <w:rPr>
+                      <w:rFonts w:ascii="Cambria Math" w:hAnsi="Cambria Math"/>
+                      <w:i/>
+                      <w:lang w:val="en-US"/>
+                    </w:rPr>
                   </m:ctrlPr>
                 </m:sSubPr>
                 <m:e>
@@ -2810,13 +2641,11 @@
               <m:sSub>
                 <m:sSubPr>
                   <m:ctrlPr>
-                    <w:ins w:id="39" w:author="JESUS ALEXIS SANCHEZ MORENO" w:date="2026-04-11T00:26:00Z" w16du:dateUtc="2026-04-11T06:26:00Z">
-                      <w:rPr>
-                        <w:rFonts w:ascii="Cambria Math" w:hAnsi="Cambria Math"/>
-                        <w:i/>
-                        <w:lang w:val="en-US"/>
-                      </w:rPr>
-                    </w:ins>
+                    <w:rPr>
+                      <w:rFonts w:ascii="Cambria Math" w:hAnsi="Cambria Math"/>
+                      <w:i/>
+                      <w:lang w:val="en-US"/>
+                    </w:rPr>
                   </m:ctrlPr>
                 </m:sSubPr>
                 <m:e>
@@ -2850,13 +2679,11 @@
               <m:sSub>
                 <m:sSubPr>
                   <m:ctrlPr>
-                    <w:ins w:id="40" w:author="JESUS ALEXIS SANCHEZ MORENO" w:date="2026-04-11T00:26:00Z" w16du:dateUtc="2026-04-11T06:26:00Z">
-                      <w:rPr>
-                        <w:rFonts w:ascii="Cambria Math" w:hAnsi="Cambria Math"/>
-                        <w:i/>
-                        <w:lang w:val="en-US"/>
-                      </w:rPr>
-                    </w:ins>
+                    <w:rPr>
+                      <w:rFonts w:ascii="Cambria Math" w:hAnsi="Cambria Math"/>
+                      <w:i/>
+                      <w:lang w:val="en-US"/>
+                    </w:rPr>
                   </m:ctrlPr>
                 </m:sSubPr>
                 <m:e>
@@ -2914,17 +2741,15 @@
           <m:sSubSup>
             <m:sSubSupPr>
               <m:ctrlPr>
-                <w:ins w:id="41" w:author="Unknown" w:date="2026-04-10T21:20:00Z" w16du:dateUtc="2026-04-11T03:20:00Z">
-                  <w:rPr>
-                    <w:rFonts w:ascii="Cambria Math" w:hAnsi="Cambria Math"/>
-                    <w:i/>
-                    <w:kern w:val="2"/>
-                    <w:sz w:val="24"/>
-                    <w:szCs w:val="24"/>
-                    <w:lang w:val="en-US"/>
-                    <w14:ligatures w14:val="standardContextual"/>
-                  </w:rPr>
-                </w:ins>
+                <w:rPr>
+                  <w:rFonts w:ascii="Cambria Math" w:hAnsi="Cambria Math"/>
+                  <w:i/>
+                  <w:kern w:val="2"/>
+                  <w:sz w:val="24"/>
+                  <w:szCs w:val="24"/>
+                  <w:lang w:val="en-US"/>
+                  <w14:ligatures w14:val="standardContextual"/>
+                </w:rPr>
               </m:ctrlPr>
             </m:sSubSupPr>
             <m:e>
@@ -2965,13 +2790,11 @@
           <m:sSub>
             <m:sSubPr>
               <m:ctrlPr>
-                <w:ins w:id="42" w:author="JESUS ALEXIS SANCHEZ MORENO" w:date="2026-04-11T00:32:00Z" w16du:dateUtc="2026-04-11T06:32:00Z">
-                  <w:rPr>
-                    <w:rFonts w:ascii="Cambria Math" w:hAnsi="Cambria Math"/>
-                    <w:i/>
-                    <w:lang w:val="en-US"/>
-                  </w:rPr>
-                </w:ins>
+                <w:rPr>
+                  <w:rFonts w:ascii="Cambria Math" w:hAnsi="Cambria Math"/>
+                  <w:i/>
+                  <w:lang w:val="en-US"/>
+                </w:rPr>
               </m:ctrlPr>
             </m:sSubPr>
             <m:e>
@@ -3003,17 +2826,15 @@
           <m:sSubSup>
             <m:sSubSupPr>
               <m:ctrlPr>
-                <w:ins w:id="43" w:author="Unknown" w:date="2026-04-10T21:20:00Z" w16du:dateUtc="2026-04-11T03:20:00Z">
-                  <w:rPr>
-                    <w:rFonts w:ascii="Cambria Math" w:hAnsi="Cambria Math"/>
-                    <w:i/>
-                    <w:kern w:val="2"/>
-                    <w:sz w:val="24"/>
-                    <w:szCs w:val="24"/>
-                    <w:lang w:val="en-US"/>
-                    <w14:ligatures w14:val="standardContextual"/>
-                  </w:rPr>
-                </w:ins>
+                <w:rPr>
+                  <w:rFonts w:ascii="Cambria Math" w:hAnsi="Cambria Math"/>
+                  <w:i/>
+                  <w:kern w:val="2"/>
+                  <w:sz w:val="24"/>
+                  <w:szCs w:val="24"/>
+                  <w:lang w:val="en-US"/>
+                  <w14:ligatures w14:val="standardContextual"/>
+                </w:rPr>
               </m:ctrlPr>
             </m:sSubSupPr>
             <m:e>
@@ -3054,13 +2875,11 @@
           <m:sSub>
             <m:sSubPr>
               <m:ctrlPr>
-                <w:ins w:id="44" w:author="JESUS ALEXIS SANCHEZ MORENO" w:date="2026-04-11T00:32:00Z" w16du:dateUtc="2026-04-11T06:32:00Z">
-                  <w:rPr>
-                    <w:rFonts w:ascii="Cambria Math" w:hAnsi="Cambria Math"/>
-                    <w:i/>
-                    <w:lang w:val="en-US"/>
-                  </w:rPr>
-                </w:ins>
+                <w:rPr>
+                  <w:rFonts w:ascii="Cambria Math" w:hAnsi="Cambria Math"/>
+                  <w:i/>
+                  <w:lang w:val="en-US"/>
+                </w:rPr>
               </m:ctrlPr>
             </m:sSubPr>
             <m:e>
@@ -3092,13 +2911,11 @@
           <m:sSub>
             <m:sSubPr>
               <m:ctrlPr>
-                <w:ins w:id="45" w:author="JESUS ALEXIS SANCHEZ MORENO" w:date="2026-04-11T00:33:00Z" w16du:dateUtc="2026-04-11T06:33:00Z">
-                  <w:rPr>
-                    <w:rFonts w:ascii="Cambria Math" w:hAnsi="Cambria Math"/>
-                    <w:i/>
-                    <w:lang w:val="en-US"/>
-                  </w:rPr>
-                </w:ins>
+                <w:rPr>
+                  <w:rFonts w:ascii="Cambria Math" w:hAnsi="Cambria Math"/>
+                  <w:i/>
+                  <w:lang w:val="en-US"/>
+                </w:rPr>
               </m:ctrlPr>
             </m:sSubPr>
             <m:e>
@@ -3241,21 +3058,7 @@
         <w:rPr>
           <w:lang w:val="en-US"/>
         </w:rPr>
-        <w:t xml:space="preserve">Following the CEQ framework, indirect taxes are incorporated at the post-fiscal income stage. In Mexico, the indirect tax is the Value Added Tax (IVA) with a rate of 16%. Certain goods and services are exempt or subject to a 0% rate (e.g., food, medicines). The estimation proceeds in four steps: </w:t>
-      </w:r>
-      <w:proofErr w:type="spellStart"/>
-      <w:r>
-        <w:rPr>
-          <w:lang w:val="en-US"/>
-        </w:rPr>
-        <w:t>i</w:t>
-      </w:r>
-      <w:proofErr w:type="spellEnd"/>
-      <w:r>
-        <w:rPr>
-          <w:lang w:val="en-US"/>
-        </w:rPr>
-        <w:t>) identification of taxable expenditure items, ii) distinction between formal and informal purchases, iii) calculation of IVA paid per household, and i</w:t>
+        <w:t>Following the CEQ framework, indirect taxes are incorporated at the post-fiscal income stage. In Mexico, the indirect tax is the Value Added Tax (IVA) with a rate of 16%. Certain goods and services are exempt or subject to a 0% rate (e.g., food, medicines). The estimation proceeds in four steps: i) identification of taxable expenditure items, ii) distinction between formal and informal purchases, iii) calculation of IVA paid per household, and i</w:t>
       </w:r>
       <w:r>
         <w:rPr>
@@ -3342,14 +3145,7 @@
           <w:highlight w:val="yellow"/>
           <w:lang w:val="en-US"/>
         </w:rPr>
-        <w:t>Classification of Individual Consumption According to Purpose</w:t>
-      </w:r>
-      <w:r>
-        <w:rPr>
-          <w:highlight w:val="yellow"/>
-          <w:lang w:val="en-US"/>
-        </w:rPr>
-        <w:t xml:space="preserve"> (</w:t>
+        <w:t>Classification of Individual Consumption According to Purpose (</w:t>
       </w:r>
       <w:r>
         <w:rPr>
@@ -3445,21 +3241,7 @@
         <w:rPr>
           <w:lang w:val="en-US"/>
         </w:rPr>
-        <w:t>For each expenditure record, a binary indicator “</w:t>
-      </w:r>
-      <w:proofErr w:type="spellStart"/>
-      <w:r>
-        <w:rPr>
-          <w:lang w:val="en-US"/>
-        </w:rPr>
-        <w:t>lleva_iva</w:t>
-      </w:r>
-      <w:proofErr w:type="spellEnd"/>
-      <w:r>
-        <w:rPr>
-          <w:lang w:val="en-US"/>
-        </w:rPr>
-        <w:t xml:space="preserve">” is set to 1 if the “clave” starts with any of the year-specific taxable prefixes, and 0 otherwise. </w:t>
+        <w:t xml:space="preserve">For each expenditure record, a binary indicator “lleva_iva” is set to 1 if the “clave” starts with any of the year-specific taxable prefixes, and 0 otherwise. </w:t>
       </w:r>
     </w:p>
     <w:p>
@@ -3494,21 +3276,7 @@
         <w:rPr>
           <w:lang w:val="en-US"/>
         </w:rPr>
-        <w:t>IVA is legally due only on transactions carried out in the formal sector. The ENIGH records the place of purchase (</w:t>
-      </w:r>
-      <w:proofErr w:type="spellStart"/>
-      <w:r>
-        <w:rPr>
-          <w:lang w:val="en-US"/>
-        </w:rPr>
-        <w:t>lugar_comp</w:t>
-      </w:r>
-      <w:proofErr w:type="spellEnd"/>
-      <w:r>
-        <w:rPr>
-          <w:lang w:val="en-US"/>
-        </w:rPr>
-        <w:t xml:space="preserve">), which includes codes for informal markets, street vendors, and other non-registered establishments. Purchases made at location with codes 1,2,3, or 17 are classified as informal. </w:t>
+        <w:t xml:space="preserve">IVA is legally due only on transactions carried out in the formal sector. The ENIGH records the place of purchase (lugar_comp), which includes codes for informal markets, street vendors, and other non-registered establishments. Purchases made at location with codes 1,2,3, or 17 are classified as informal. </w:t>
       </w:r>
     </w:p>
     <w:p>
@@ -3568,21 +3336,7 @@
         <w:rPr>
           <w:lang w:val="en-US"/>
         </w:rPr>
-        <w:t>(</w:t>
-      </w:r>
-      <w:proofErr w:type="spellStart"/>
-      <w:r>
-        <w:rPr>
-          <w:lang w:val="en-US"/>
-        </w:rPr>
-        <w:t>tianguis</w:t>
-      </w:r>
-      <w:proofErr w:type="spellEnd"/>
-      <w:r>
-        <w:rPr>
-          <w:lang w:val="en-US"/>
-        </w:rPr>
-        <w:t>)</w:t>
+        <w:t>(tianguis)</w:t>
       </w:r>
     </w:p>
     <w:p>
@@ -3644,21 +3398,7 @@
           <w:lang w:val="en-US"/>
         </w:rPr>
         <w:lastRenderedPageBreak/>
-        <w:t>For all other location codes (formal establishments, supermarkets, department stores, etc.), the purchase is considered formal. A binary variable “</w:t>
-      </w:r>
-      <w:proofErr w:type="spellStart"/>
-      <w:r>
-        <w:rPr>
-          <w:lang w:val="en-US"/>
-        </w:rPr>
-        <w:t>es_formal</w:t>
-      </w:r>
-      <w:proofErr w:type="spellEnd"/>
-      <w:r>
-        <w:rPr>
-          <w:lang w:val="en-US"/>
-        </w:rPr>
-        <w:t xml:space="preserve">” equals 1 if the purchase is formal, and 0 otherwise. </w:t>
+        <w:t xml:space="preserve">For all other location codes (formal establishments, supermarkets, department stores, etc.), the purchase is considered formal. A binary variable “es_formal” equals 1 if the purchase is formal, and 0 otherwise. </w:t>
       </w:r>
     </w:p>
     <w:p>
@@ -3693,21 +3433,7 @@
         <w:rPr>
           <w:lang w:val="en-US"/>
         </w:rPr>
-        <w:t>For a formal purchase of a taxable good, the IVA paid is embedded in the reported expenditure. The relationship between the total amount paid (</w:t>
-      </w:r>
-      <w:proofErr w:type="spellStart"/>
-      <w:r>
-        <w:rPr>
-          <w:lang w:val="en-US"/>
-        </w:rPr>
-        <w:t>gasto_tri</w:t>
-      </w:r>
-      <w:proofErr w:type="spellEnd"/>
-      <w:r>
-        <w:rPr>
-          <w:lang w:val="en-US"/>
-        </w:rPr>
-        <w:t>) and the pre-tax price P is:</w:t>
+        <w:t>For a formal purchase of a taxable good, the IVA paid is embedded in the reported expenditure. The relationship between the total amount paid (gasto_tri) and the pre-tax price P is:</w:t>
       </w:r>
     </w:p>
     <w:p>
@@ -3728,13 +3454,11 @@
           <m:d>
             <m:dPr>
               <m:ctrlPr>
-                <w:ins w:id="48" w:author="JESUS ALEXIS SANCHEZ MORENO" w:date="2026-04-11T09:42:00Z" w16du:dateUtc="2026-04-11T15:42:00Z">
-                  <w:rPr>
-                    <w:rFonts w:ascii="Cambria Math" w:hAnsi="Cambria Math"/>
-                    <w:i/>
-                    <w:lang w:val="en-US"/>
-                  </w:rPr>
-                </w:ins>
+                <w:rPr>
+                  <w:rFonts w:ascii="Cambria Math" w:hAnsi="Cambria Math"/>
+                  <w:i/>
+                  <w:lang w:val="en-US"/>
+                </w:rPr>
               </m:ctrlPr>
             </m:dPr>
             <m:e>
@@ -3788,26 +3512,22 @@
           <m:d>
             <m:dPr>
               <m:ctrlPr>
-                <w:ins w:id="49" w:author="JESUS ALEXIS SANCHEZ MORENO" w:date="2026-04-11T09:43:00Z" w16du:dateUtc="2026-04-11T15:43:00Z">
-                  <w:rPr>
-                    <w:rFonts w:ascii="Cambria Math" w:hAnsi="Cambria Math"/>
-                    <w:i/>
-                    <w:lang w:val="en-US"/>
-                  </w:rPr>
-                </w:ins>
+                <w:rPr>
+                  <w:rFonts w:ascii="Cambria Math" w:hAnsi="Cambria Math"/>
+                  <w:i/>
+                  <w:lang w:val="en-US"/>
+                </w:rPr>
               </m:ctrlPr>
             </m:dPr>
             <m:e>
               <m:f>
                 <m:fPr>
                   <m:ctrlPr>
-                    <w:ins w:id="50" w:author="JESUS ALEXIS SANCHEZ MORENO" w:date="2026-04-11T09:43:00Z" w16du:dateUtc="2026-04-11T15:43:00Z">
-                      <w:rPr>
-                        <w:rFonts w:ascii="Cambria Math" w:hAnsi="Cambria Math"/>
-                        <w:i/>
-                        <w:lang w:val="en-US"/>
-                      </w:rPr>
-                    </w:ins>
+                    <w:rPr>
+                      <w:rFonts w:ascii="Cambria Math" w:hAnsi="Cambria Math"/>
+                      <w:i/>
+                      <w:lang w:val="en-US"/>
+                    </w:rPr>
                   </m:ctrlPr>
                 </m:fPr>
                 <m:num>
@@ -3850,13 +3570,11 @@
         <m:f>
           <m:fPr>
             <m:ctrlPr>
-              <w:ins w:id="51" w:author="JESUS ALEXIS SANCHEZ MORENO" w:date="2026-04-11T09:44:00Z" w16du:dateUtc="2026-04-11T15:44:00Z">
-                <w:rPr>
-                  <w:rFonts w:ascii="Cambria Math" w:hAnsi="Cambria Math"/>
-                  <w:i/>
-                  <w:lang w:val="en-US"/>
-                </w:rPr>
-              </w:ins>
+              <w:rPr>
+                <w:rFonts w:ascii="Cambria Math" w:hAnsi="Cambria Math"/>
+                <w:i/>
+                <w:lang w:val="en-US"/>
+              </w:rPr>
             </m:ctrlPr>
           </m:fPr>
           <m:num>
@@ -3890,49 +3608,7 @@
         <w:rPr>
           <w:lang w:val="en-US"/>
         </w:rPr>
-        <w:t xml:space="preserve"> is applied only when both conditions hold: the item is taxable (</w:t>
-      </w:r>
-      <w:proofErr w:type="spellStart"/>
-      <w:r>
-        <w:rPr>
-          <w:lang w:val="en-US"/>
-        </w:rPr>
-        <w:t>lleva_iva</w:t>
-      </w:r>
-      <w:proofErr w:type="spellEnd"/>
-      <w:r>
-        <w:rPr>
-          <w:lang w:val="en-US"/>
-        </w:rPr>
-        <w:t xml:space="preserve"> = 1</w:t>
-      </w:r>
-      <w:proofErr w:type="gramStart"/>
-      <w:r>
-        <w:rPr>
-          <w:lang w:val="en-US"/>
-        </w:rPr>
-        <w:t>)</w:t>
-      </w:r>
-      <w:proofErr w:type="gramEnd"/>
-      <w:r>
-        <w:rPr>
-          <w:lang w:val="en-US"/>
-        </w:rPr>
-        <w:t xml:space="preserve"> and the purchase is formal (</w:t>
-      </w:r>
-      <w:proofErr w:type="spellStart"/>
-      <w:r>
-        <w:rPr>
-          <w:lang w:val="en-US"/>
-        </w:rPr>
-        <w:t>es_formal</w:t>
-      </w:r>
-      <w:proofErr w:type="spellEnd"/>
-      <w:r>
-        <w:rPr>
-          <w:lang w:val="en-US"/>
-        </w:rPr>
-        <w:t xml:space="preserve"> = 1). </w:t>
+        <w:t xml:space="preserve"> is applied only when both conditions hold: the item is taxable (lleva_iva = 1) and the purchase is formal (es_formal = 1). </w:t>
       </w:r>
     </w:p>
     <w:p>
@@ -3981,26 +3657,22 @@
               <m:begChr m:val="{"/>
               <m:endChr m:val=""/>
               <m:ctrlPr>
-                <w:ins w:id="52" w:author="Unknown" w:date="2026-04-11T09:48:00Z" w16du:dateUtc="2026-04-11T15:48:00Z">
-                  <w:rPr>
-                    <w:rFonts w:ascii="Cambria Math" w:hAnsi="Cambria Math"/>
-                    <w:i/>
-                    <w:lang w:val="en-US"/>
-                  </w:rPr>
-                </w:ins>
+                <w:rPr>
+                  <w:rFonts w:ascii="Cambria Math" w:hAnsi="Cambria Math"/>
+                  <w:i/>
+                  <w:lang w:val="en-US"/>
+                </w:rPr>
               </m:ctrlPr>
             </m:dPr>
             <m:e>
               <m:eqArr>
                 <m:eqArrPr>
                   <m:ctrlPr>
-                    <w:ins w:id="53" w:author="Unknown" w:date="2026-04-11T09:48:00Z" w16du:dateUtc="2026-04-11T15:48:00Z">
-                      <w:rPr>
-                        <w:rFonts w:ascii="Cambria Math" w:hAnsi="Cambria Math"/>
-                        <w:i/>
-                        <w:lang w:val="en-US"/>
-                      </w:rPr>
-                    </w:ins>
+                    <w:rPr>
+                      <w:rFonts w:ascii="Cambria Math" w:hAnsi="Cambria Math"/>
+                      <w:i/>
+                      <w:lang w:val="en-US"/>
+                    </w:rPr>
                   </m:ctrlPr>
                 </m:eqArrPr>
                 <m:e>
@@ -4066,35 +3738,7 @@
         <w:rPr>
           <w:lang w:val="en-US"/>
         </w:rPr>
-        <w:t xml:space="preserve">The total IVA paid by a </w:t>
-      </w:r>
-      <w:proofErr w:type="spellStart"/>
-      <w:r>
-        <w:rPr>
-          <w:lang w:val="en-US"/>
-        </w:rPr>
-        <w:t>househols</w:t>
-      </w:r>
-      <w:proofErr w:type="spellEnd"/>
-      <w:r>
-        <w:rPr>
-          <w:lang w:val="en-US"/>
-        </w:rPr>
-        <w:t xml:space="preserve"> in a quarter is the sum of </w:t>
-      </w:r>
-      <w:proofErr w:type="spellStart"/>
-      <w:r>
-        <w:rPr>
-          <w:lang w:val="en-US"/>
-        </w:rPr>
-        <w:t>iva_partida</w:t>
-      </w:r>
-      <w:proofErr w:type="spellEnd"/>
-      <w:r>
-        <w:rPr>
-          <w:lang w:val="en-US"/>
-        </w:rPr>
-        <w:t xml:space="preserve"> over all its expenditure records:</w:t>
+        <w:t>The total IVA paid by a househols in a quarter is the sum of iva_partida over all its expenditure records:</w:t>
       </w:r>
     </w:p>
     <w:p>
@@ -4115,13 +3759,11 @@
           <m:sSub>
             <m:sSubPr>
               <m:ctrlPr>
-                <w:ins w:id="54" w:author="JESUS ALEXIS SANCHEZ MORENO" w:date="2026-04-11T09:50:00Z" w16du:dateUtc="2026-04-11T15:50:00Z">
-                  <w:rPr>
-                    <w:rFonts w:ascii="Cambria Math" w:hAnsi="Cambria Math"/>
-                    <w:i/>
-                    <w:lang w:val="en-US"/>
-                  </w:rPr>
-                </w:ins>
+                <w:rPr>
+                  <w:rFonts w:ascii="Cambria Math" w:hAnsi="Cambria Math"/>
+                  <w:i/>
+                  <w:lang w:val="en-US"/>
+                </w:rPr>
               </m:ctrlPr>
             </m:sSubPr>
             <m:e>
@@ -4156,13 +3798,11 @@
               <m:limLoc m:val="undOvr"/>
               <m:supHide m:val="1"/>
               <m:ctrlPr>
-                <w:ins w:id="55" w:author="Unknown" w:date="2026-04-11T09:51:00Z" w16du:dateUtc="2026-04-11T15:51:00Z">
-                  <w:rPr>
-                    <w:rFonts w:ascii="Cambria Math" w:hAnsi="Cambria Math"/>
-                    <w:i/>
-                    <w:lang w:val="en-US"/>
-                  </w:rPr>
-                </w:ins>
+                <w:rPr>
+                  <w:rFonts w:ascii="Cambria Math" w:hAnsi="Cambria Math"/>
+                  <w:i/>
+                  <w:lang w:val="en-US"/>
+                </w:rPr>
               </m:ctrlPr>
             </m:naryPr>
             <m:sub>
@@ -4239,55 +3879,7 @@
           <w:highlight w:val="yellow"/>
           <w:lang w:val="en-US"/>
         </w:rPr>
-        <w:t xml:space="preserve">First, we define a “taxable expenditure base” for the household, denoted </w:t>
-      </w:r>
-      <w:proofErr w:type="spellStart"/>
-      <w:r>
-        <w:rPr>
-          <w:highlight w:val="yellow"/>
-          <w:lang w:val="en-US"/>
-        </w:rPr>
-        <w:t>Gasto_HH_tri</w:t>
-      </w:r>
-      <w:proofErr w:type="spellEnd"/>
-      <w:r>
-        <w:rPr>
-          <w:highlight w:val="yellow"/>
-          <w:lang w:val="en-US"/>
-        </w:rPr>
-        <w:t xml:space="preserve">. This base excludes expenditure on goods that are </w:t>
-      </w:r>
-      <w:proofErr w:type="spellStart"/>
-      <w:r>
-        <w:rPr>
-          <w:highlight w:val="yellow"/>
-          <w:lang w:val="en-US"/>
-        </w:rPr>
-        <w:t>zere</w:t>
-      </w:r>
-      <w:proofErr w:type="spellEnd"/>
-      <w:r>
-        <w:rPr>
-          <w:highlight w:val="yellow"/>
-          <w:lang w:val="en-US"/>
-        </w:rPr>
-        <w:t xml:space="preserve">-rated or exempt (food, cleaning, personal care), because those items do not generate IVA even if purchased formally. Usually the ENIGH </w:t>
-      </w:r>
-      <w:proofErr w:type="spellStart"/>
-      <w:r>
-        <w:rPr>
-          <w:highlight w:val="yellow"/>
-          <w:lang w:val="en-US"/>
-        </w:rPr>
-        <w:t>concentradohogar</w:t>
-      </w:r>
-      <w:proofErr w:type="spellEnd"/>
-      <w:r>
-        <w:rPr>
-          <w:highlight w:val="yellow"/>
-          <w:lang w:val="en-US"/>
-        </w:rPr>
-        <w:t xml:space="preserve"> file: </w:t>
+        <w:t xml:space="preserve">First, we define a “taxable expenditure base” for the household, denoted Gasto_HH_tri. This base excludes expenditure on goods that are zere-rated or exempt (food, cleaning, personal care), because those items do not generate IVA even if purchased formally. Usually the ENIGH concentradohogar file: </w:t>
       </w:r>
     </w:p>
     <w:p>
@@ -4311,14 +3903,12 @@
           <m:d>
             <m:dPr>
               <m:ctrlPr>
-                <w:ins w:id="56" w:author="JESUS ALEXIS SANCHEZ MORENO" w:date="2026-04-11T10:07:00Z" w16du:dateUtc="2026-04-11T16:07:00Z">
-                  <w:rPr>
-                    <w:rFonts w:ascii="Cambria Math" w:hAnsi="Cambria Math"/>
-                    <w:i/>
-                    <w:highlight w:val="yellow"/>
-                    <w:lang w:val="en-US"/>
-                  </w:rPr>
-                </w:ins>
+                <w:rPr>
+                  <w:rFonts w:ascii="Cambria Math" w:hAnsi="Cambria Math"/>
+                  <w:i/>
+                  <w:highlight w:val="yellow"/>
+                  <w:lang w:val="en-US"/>
+                </w:rPr>
               </m:ctrlPr>
             </m:dPr>
             <m:e>
@@ -4367,39 +3957,7 @@
           <w:highlight w:val="yellow"/>
           <w:lang w:val="en-US"/>
         </w:rPr>
-        <w:t xml:space="preserve">Gasto </w:t>
-      </w:r>
-      <w:proofErr w:type="spellStart"/>
-      <w:r>
-        <w:rPr>
-          <w:highlight w:val="yellow"/>
-          <w:lang w:val="en-US"/>
-        </w:rPr>
-        <w:t>mon</w:t>
-      </w:r>
-      <w:proofErr w:type="spellEnd"/>
-      <w:r>
-        <w:rPr>
-          <w:highlight w:val="yellow"/>
-          <w:lang w:val="en-US"/>
-        </w:rPr>
-        <w:t xml:space="preserve"> = total </w:t>
-      </w:r>
-      <w:proofErr w:type="spellStart"/>
-      <w:r>
-        <w:rPr>
-          <w:highlight w:val="yellow"/>
-          <w:lang w:val="en-US"/>
-        </w:rPr>
-        <w:t>quartly</w:t>
-      </w:r>
-      <w:proofErr w:type="spellEnd"/>
-      <w:r>
-        <w:rPr>
-          <w:highlight w:val="yellow"/>
-          <w:lang w:val="en-US"/>
-        </w:rPr>
-        <w:t xml:space="preserve"> monetary expenditure, </w:t>
+        <w:t xml:space="preserve">Gasto mon = total quartly monetary expenditure, </w:t>
       </w:r>
     </w:p>
     <w:p>
@@ -4434,21 +3992,12 @@
           <w:lang w:val="en-US"/>
         </w:rPr>
       </w:pPr>
-      <w:proofErr w:type="spellStart"/>
       <w:r>
         <w:rPr>
           <w:highlight w:val="yellow"/>
           <w:lang w:val="en-US"/>
         </w:rPr>
-        <w:t>Limpieza</w:t>
-      </w:r>
-      <w:proofErr w:type="spellEnd"/>
-      <w:r>
-        <w:rPr>
-          <w:highlight w:val="yellow"/>
-          <w:lang w:val="en-US"/>
-        </w:rPr>
-        <w:t xml:space="preserve"> = expenditure on cleaning products, </w:t>
+        <w:t xml:space="preserve">Limpieza = expenditure on cleaning products, </w:t>
       </w:r>
     </w:p>
     <w:p>
@@ -4463,52 +4012,27 @@
           <w:lang w:val="en-US"/>
         </w:rPr>
       </w:pPr>
-      <w:proofErr w:type="spellStart"/>
       <w:r>
         <w:rPr>
           <w:highlight w:val="yellow"/>
           <w:lang w:val="en-US"/>
         </w:rPr>
-        <w:t>Cuidados</w:t>
-      </w:r>
-      <w:proofErr w:type="spellEnd"/>
-      <w:r>
+        <w:t xml:space="preserve">Cuidados = expenditure on personal care. </w:t>
+      </w:r>
+    </w:p>
+    <w:p>
+      <w:pPr>
         <w:rPr>
           <w:highlight w:val="yellow"/>
           <w:lang w:val="en-US"/>
         </w:rPr>
-        <w:t xml:space="preserve"> = expenditure on personal care. </w:t>
-      </w:r>
-    </w:p>
-    <w:p>
-      <w:pPr>
+      </w:pPr>
+      <w:r>
         <w:rPr>
           <w:highlight w:val="yellow"/>
           <w:lang w:val="en-US"/>
         </w:rPr>
-      </w:pPr>
-      <w:r>
-        <w:rPr>
-          <w:highlight w:val="yellow"/>
-          <w:lang w:val="en-US"/>
-        </w:rPr>
-        <w:t xml:space="preserve">The IVA attributable to the household’s </w:t>
-      </w:r>
-      <w:proofErr w:type="spellStart"/>
-      <w:r>
-        <w:rPr>
-          <w:highlight w:val="yellow"/>
-          <w:lang w:val="en-US"/>
-        </w:rPr>
-        <w:t>disponsable</w:t>
-      </w:r>
-      <w:proofErr w:type="spellEnd"/>
-      <w:r>
-        <w:rPr>
-          <w:highlight w:val="yellow"/>
-          <w:lang w:val="en-US"/>
-        </w:rPr>
-        <w:t xml:space="preserve"> income is then computed as: </w:t>
+        <w:t xml:space="preserve">The IVA attributable to the household’s disponsable income is then computed as: </w:t>
       </w:r>
     </w:p>
     <w:p>
@@ -4533,42 +4057,36 @@
               <m:begChr m:val="{"/>
               <m:endChr m:val=""/>
               <m:ctrlPr>
-                <w:ins w:id="57" w:author="Unknown" w:date="2026-04-11T09:48:00Z" w16du:dateUtc="2026-04-11T15:48:00Z">
-                  <w:rPr>
-                    <w:rFonts w:ascii="Cambria Math" w:hAnsi="Cambria Math"/>
-                    <w:i/>
-                    <w:highlight w:val="yellow"/>
-                    <w:lang w:val="en-US"/>
-                  </w:rPr>
-                </w:ins>
+                <w:rPr>
+                  <w:rFonts w:ascii="Cambria Math" w:hAnsi="Cambria Math"/>
+                  <w:i/>
+                  <w:highlight w:val="yellow"/>
+                  <w:lang w:val="en-US"/>
+                </w:rPr>
               </m:ctrlPr>
             </m:dPr>
             <m:e>
               <m:eqArr>
                 <m:eqArrPr>
                   <m:ctrlPr>
-                    <w:ins w:id="58" w:author="Unknown" w:date="2026-04-11T09:48:00Z" w16du:dateUtc="2026-04-11T15:48:00Z">
-                      <w:rPr>
-                        <w:rFonts w:ascii="Cambria Math" w:hAnsi="Cambria Math"/>
-                        <w:i/>
-                        <w:highlight w:val="yellow"/>
-                        <w:lang w:val="en-US"/>
-                      </w:rPr>
-                    </w:ins>
+                    <w:rPr>
+                      <w:rFonts w:ascii="Cambria Math" w:hAnsi="Cambria Math"/>
+                      <w:i/>
+                      <w:highlight w:val="yellow"/>
+                      <w:lang w:val="en-US"/>
+                    </w:rPr>
                   </m:ctrlPr>
                 </m:eqArrPr>
                 <m:e>
                   <m:f>
                     <m:fPr>
                       <m:ctrlPr>
-                        <w:ins w:id="59" w:author="JESUS ALEXIS SANCHEZ MORENO" w:date="2026-04-11T10:09:00Z" w16du:dateUtc="2026-04-11T16:09:00Z">
-                          <w:rPr>
-                            <w:rFonts w:ascii="Cambria Math" w:hAnsi="Cambria Math"/>
-                            <w:i/>
-                            <w:highlight w:val="yellow"/>
-                            <w:lang w:val="en-US"/>
-                          </w:rPr>
-                        </w:ins>
+                        <w:rPr>
+                          <w:rFonts w:ascii="Cambria Math" w:hAnsi="Cambria Math"/>
+                          <w:i/>
+                          <w:highlight w:val="yellow"/>
+                          <w:lang w:val="en-US"/>
+                        </w:rPr>
                       </m:ctrlPr>
                     </m:fPr>
                     <m:num>
@@ -4628,71 +4146,7 @@
           <w:highlight w:val="yellow"/>
           <w:lang w:val="en-US"/>
         </w:rPr>
-        <w:t xml:space="preserve">Where </w:t>
-      </w:r>
-      <w:proofErr w:type="spellStart"/>
-      <w:r>
-        <w:rPr>
-          <w:highlight w:val="yellow"/>
-          <w:lang w:val="en-US"/>
-        </w:rPr>
-        <w:t>ing</w:t>
-      </w:r>
-      <w:proofErr w:type="spellEnd"/>
-      <w:r>
-        <w:rPr>
-          <w:highlight w:val="yellow"/>
-          <w:lang w:val="en-US"/>
-        </w:rPr>
-        <w:t xml:space="preserve"> </w:t>
-      </w:r>
-      <w:proofErr w:type="spellStart"/>
-      <w:r>
-        <w:rPr>
-          <w:highlight w:val="yellow"/>
-          <w:lang w:val="en-US"/>
-        </w:rPr>
-        <w:t>cor</w:t>
-      </w:r>
-      <w:proofErr w:type="spellEnd"/>
-      <w:r>
-        <w:rPr>
-          <w:highlight w:val="yellow"/>
-          <w:lang w:val="en-US"/>
-        </w:rPr>
-        <w:t xml:space="preserve"> is the household’s current </w:t>
-      </w:r>
-      <w:proofErr w:type="spellStart"/>
-      <w:r>
-        <w:rPr>
-          <w:highlight w:val="yellow"/>
-          <w:lang w:val="en-US"/>
-        </w:rPr>
-        <w:t>disponsable</w:t>
-      </w:r>
-      <w:proofErr w:type="spellEnd"/>
-      <w:r>
-        <w:rPr>
-          <w:highlight w:val="yellow"/>
-          <w:lang w:val="en-US"/>
-        </w:rPr>
-        <w:t xml:space="preserve"> income (the sum of all monetary income after direct taxes and transfers, as defined in the CEQ framework). This imputation assumes that the effective Iva rate on taxable expenditure is constant across households and that the tax burden scales proportionally with </w:t>
-      </w:r>
-      <w:proofErr w:type="spellStart"/>
-      <w:r>
-        <w:rPr>
-          <w:highlight w:val="yellow"/>
-          <w:lang w:val="en-US"/>
-        </w:rPr>
-        <w:t>disponsable</w:t>
-      </w:r>
-      <w:proofErr w:type="spellEnd"/>
-      <w:r>
-        <w:rPr>
-          <w:highlight w:val="yellow"/>
-          <w:lang w:val="en-US"/>
-        </w:rPr>
-        <w:t xml:space="preserve"> income within the taxable consumption base.</w:t>
+        <w:t>Where ing cor is the household’s current disponsable income (the sum of all monetary income after direct taxes and transfers, as defined in the CEQ framework). This imputation assumes that the effective Iva rate on taxable expenditure is constant across households and that the tax burden scales proportionally with disponsable income within the taxable consumption base.</w:t>
       </w:r>
       <w:r>
         <w:rPr>
@@ -4792,69 +4246,6 @@
         </w:rPr>
       </w:pPr>
     </w:p>
-    <w:p>
-      <w:pPr>
-        <w:rPr>
-          <w:lang w:val="en-US"/>
-        </w:rPr>
-      </w:pPr>
-    </w:p>
-    <w:p>
-      <w:pPr>
-        <w:rPr>
-          <w:lang w:val="en-US"/>
-        </w:rPr>
-      </w:pPr>
-    </w:p>
-    <w:p>
-      <w:pPr>
-        <w:rPr>
-          <w:lang w:val="en-US"/>
-        </w:rPr>
-      </w:pPr>
-    </w:p>
-    <w:p>
-      <w:pPr>
-        <w:rPr>
-          <w:lang w:val="en-US"/>
-        </w:rPr>
-      </w:pPr>
-    </w:p>
-    <w:p>
-      <w:pPr>
-        <w:rPr>
-          <w:lang w:val="en-US"/>
-        </w:rPr>
-      </w:pPr>
-    </w:p>
-    <w:p>
-      <w:pPr>
-        <w:rPr>
-          <w:lang w:val="en-US"/>
-        </w:rPr>
-      </w:pPr>
-    </w:p>
-    <w:p>
-      <w:pPr>
-        <w:rPr>
-          <w:lang w:val="en-US"/>
-        </w:rPr>
-      </w:pPr>
-    </w:p>
-    <w:p>
-      <w:pPr>
-        <w:rPr>
-          <w:lang w:val="en-US"/>
-        </w:rPr>
-      </w:pPr>
-    </w:p>
-    <w:p>
-      <w:pPr>
-        <w:rPr>
-          <w:lang w:val="en-US"/>
-        </w:rPr>
-      </w:pPr>
-    </w:p>
     <w:sectPr>
       <w:pgSz w:w="12240" w:h="15840"/>
       <w:pgMar w:top="1440" w:right="1440" w:bottom="1440" w:left="1440" w:header="708" w:footer="708" w:gutter="0"/>
@@ -4929,34 +4320,14 @@
       <w:r>
         <w:t xml:space="preserve"> </w:t>
       </w:r>
-      <w:r>
-        <w:fldChar w:fldCharType="begin"/>
-      </w:r>
-      <w:ins w:id="46" w:author="JESUS ALEXIS SANCHEZ MORENO" w:date="2026-04-15T23:45:00Z" w16du:dateUtc="2026-04-16T05:45:00Z">
+      <w:hyperlink r:id="rId1" w:history="1">
         <w:r>
-          <w:instrText>HYPERLINK "</w:instrText>
+          <w:rPr>
+            <w:rStyle w:val="Hyperlink"/>
+          </w:rPr>
+          <w:t>https://www.inegi.org.mx/contenidos/app/scian/ccif.pdf</w:t>
         </w:r>
-      </w:ins>
-      <w:r>
-        <w:instrText>https://www.inegi.org.mx/contenidos/app/scian/ccif.pdf</w:instrText>
-      </w:r>
-      <w:ins w:id="47" w:author="JESUS ALEXIS SANCHEZ MORENO" w:date="2026-04-15T23:45:00Z" w16du:dateUtc="2026-04-16T05:45:00Z">
-        <w:r>
-          <w:instrText>"</w:instrText>
-        </w:r>
-      </w:ins>
-      <w:r>
-        <w:fldChar w:fldCharType="separate"/>
-      </w:r>
-      <w:r>
-        <w:rPr>
-          <w:rStyle w:val="Hyperlink"/>
-        </w:rPr>
-        <w:t>https://www.inegi.org.mx/contenidos/app/scian/ccif.pdf</w:t>
-      </w:r>
-      <w:r>
-        <w:fldChar w:fldCharType="end"/>
-      </w:r>
+      </w:hyperlink>
       <w:r>
         <w:t xml:space="preserve"> </w:t>
       </w:r>
@@ -5476,14 +4847,6 @@
     <w:abstractNumId w:val="0"/>
   </w:num>
 </w:numbering>
-</file>
-
-<file path=word/people.xml><?xml version="1.0" encoding="utf-8"?>
-<w15:people xmlns:wpc="http://schemas.microsoft.com/office/word/2010/wordprocessingCanvas" xmlns:cx="http://schemas.microsoft.com/office/drawing/2014/chartex" xmlns:cx1="http://schemas.microsoft.com/office/drawing/2015/9/8/chartex" xmlns:cx2="http://schemas.microsoft.com/office/drawing/2015/10/21/chartex" xmlns:cx3="http://schemas.microsoft.com/office/drawing/2016/5/9/chartex" xmlns:cx4="http://schemas.microsoft.com/office/drawing/2016/5/10/chartex" xmlns:cx5="http://schemas.microsoft.com/office/drawing/2016/5/11/chartex" xmlns:cx6="http://schemas.microsoft.com/office/drawing/2016/5/12/chartex" xmlns:cx7="http://schemas.microsoft.com/office/drawing/2016/5/13/chartex" xmlns:cx8="http://schemas.microsoft.com/office/drawing/2016/5/14/chartex" xmlns:mc="http://schemas.openxmlformats.org/markup-compatibility/2006" xmlns:aink="http://schemas.microsoft.com/office/drawing/2016/ink" xmlns:am3d="http://schemas.microsoft.com/office/drawing/2017/model3d" xmlns:o="urn:schemas-microsoft-com:office:office" xmlns:oel="http://schemas.microsoft.com/office/2019/extlst" xmlns:r="http://schemas.openxmlformats.org/officeDocument/2006/relationships" xmlns:m="http://schemas.openxmlformats.org/officeDocument/2006/math" xmlns:v="urn:schemas-microsoft-com:vml" xmlns:wp14="http://schemas.microsoft.com/office/word/2010/wordprocessingDrawing" xmlns:wp="http://schemas.openxmlformats.org/drawingml/2006/wordprocessingDrawing" xmlns:w10="urn:schemas-microsoft-com:office:word" xmlns:w="http://schemas.openxmlformats.org/wordprocessingml/2006/main" xmlns:w14="http://schemas.microsoft.com/office/word/2010/wordml" xmlns:w15="http://schemas.microsoft.com/office/word/2012/wordml" xmlns:w16cex="http://schemas.microsoft.com/office/word/2018/wordml/cex" xmlns:w16cid="http://schemas.microsoft.com/office/word/2016/wordml/cid" xmlns:w16="http://schemas.microsoft.com/office/word/2018/wordml" xmlns:w16du="http://schemas.microsoft.com/office/word/2023/wordml/word16du" xmlns:w16sdtdh="http://schemas.microsoft.com/office/word/2020/wordml/sdtdatahash" xmlns:w16sdtfl="http://schemas.microsoft.com/office/word/2024/wordml/sdtformatlock" xmlns:w16se="http://schemas.microsoft.com/office/word/2015/wordml/symex" xmlns:wpg="http://schemas.microsoft.com/office/word/2010/wordprocessingGroup" xmlns:wpi="http://schemas.microsoft.com/office/word/2010/wordprocessingInk" xmlns:wne="http://schemas.microsoft.com/office/word/2006/wordml" xmlns:wps="http://schemas.microsoft.com/office/word/2010/wordprocessingShape" mc:Ignorable="w14 w15 w16se w16cid w16 w16cex w16sdtdh w16sdtfl w16du wp14">
-  <w15:person w15:author="JESUS ALEXIS SANCHEZ MORENO">
-    <w15:presenceInfo w15:providerId="AD" w15:userId="S::sm224470329@alm.buap.mx::cc507432-4dad-4b59-836e-6cfd85640552"/>
-  </w15:person>
-</w15:people>
 </file>
 
 <file path=word/styles.xml><?xml version="1.0" encoding="utf-8"?>
@@ -6971,7 +6334,7 @@
 </file>
 
 <file path=customXml/itemProps1.xml><?xml version="1.0" encoding="utf-8"?>
-<ds:datastoreItem xmlns:ds="http://schemas.openxmlformats.org/officeDocument/2006/customXml" ds:itemID="{AC8061F9-D96B-2246-BDA0-22EE4AC59427}">
+<ds:datastoreItem xmlns:ds="http://schemas.openxmlformats.org/officeDocument/2006/customXml" ds:itemID="{C74DF4F1-B9B4-264E-B13F-286600F2CA7B}">
   <ds:schemaRefs>
     <ds:schemaRef ds:uri="http://schemas.openxmlformats.org/officeDocument/2006/bibliography"/>
   </ds:schemaRefs>

</xml_diff>